<commit_message>
Rapordaki yollar src/output olarak düzeltildi, SDOF notebook'ları eklendi
</commit_message>
<xml_diff>
--- a/ENG401_Veri_Tasnifi_Kisa.docx
+++ b/ENG401_Veri_Tasnifi_Kisa.docx
@@ -1729,7 +1729,7 @@
           <w:sz w:val="19"/>
           <w:szCs w:val="19"/>
         </w:rPr>
-        <w:t xml:space="preserve">kod/cikti/</w:t>
+        <w:t xml:space="preserve">src/output/</w:t>
       </w:r>
       <w:r>
         <w:t xml:space="preserve"> klasörüne yazılıyor.</w:t>
@@ -3387,7 +3387,7 @@
           <w:sz w:val="17"/>
           <w:szCs w:val="17"/>
         </w:rPr>
-        <w:t xml:space="preserve">GİRDİ                                  İŞLEM                    ÇIKTI (kod/cikti/)</w:t>
+        <w:t xml:space="preserve">GİRDİ                                  İŞLEM                    ÇIKTI (src/output/)</w:t>
       </w:r>
     </w:p>
     <w:p>

</xml_diff>

<commit_message>
Varsayımlar kaldırıldı; sadece veri, makale ve veri seti notebook'larına dayalı envanter
</commit_message>
<xml_diff>
--- a/ENG401_Veri_Tasnifi_Kisa.docx
+++ b/ENG401_Veri_Tasnifi_Kisa.docx
@@ -39,10 +39,111 @@
     </w:p>
     <w:p>
       <w:pPr>
+        <w:spacing w:after="120" w:line="288"/>
+        <w:jc w:val="both"/>
+      </w:pPr>
+      <w:r>
+        <w:t xml:space="preserve">Bu belgedeki her bilgi aşağıdaki dört kaynaktan birine dayanır. Kaynak, ilgili yerde köşeli parantezle belirtilmiştir:</w:t>
+      </w:r>
+    </w:p>
+    <w:p>
+      <w:pPr>
+        <w:pStyle w:val="ListParagraph"/>
+        <w:numPr>
+          <w:ilvl w:val="0"/>
+          <w:numId w:val="2"/>
+        </w:numPr>
+        <w:spacing w:after="60" w:line="276"/>
+      </w:pPr>
+      <w:r>
+        <w:rPr>
+          <w:b/>
+          <w:bCs/>
+        </w:rPr>
+        <w:t xml:space="preserve">[V]</w:t>
+      </w:r>
+      <w:r>
+        <w:t xml:space="preserve"> Veri dosyalarının kendisi (h5 attribute'ları, txt/csv sütunları)</w:t>
+      </w:r>
+    </w:p>
+    <w:p>
+      <w:pPr>
+        <w:pStyle w:val="ListParagraph"/>
+        <w:numPr>
+          <w:ilvl w:val="0"/>
+          <w:numId w:val="2"/>
+        </w:numPr>
+        <w:spacing w:after="60" w:line="276"/>
+      </w:pPr>
+      <w:r>
+        <w:rPr>
+          <w:b/>
+          <w:bCs/>
+        </w:rPr>
+        <w:t xml:space="preserve">[M]</w:t>
+      </w:r>
+      <w:r>
+        <w:t xml:space="preserve"> Whelan vd. (2025), Route 345 veri makalesi, J. Bridge Eng. 30(7)</w:t>
+      </w:r>
+    </w:p>
+    <w:p>
+      <w:pPr>
+        <w:pStyle w:val="ListParagraph"/>
+        <w:numPr>
+          <w:ilvl w:val="0"/>
+          <w:numId w:val="2"/>
+        </w:numPr>
+        <w:spacing w:after="60" w:line="276"/>
+      </w:pPr>
+      <w:r>
+        <w:rPr>
+          <w:b/>
+          <w:bCs/>
+        </w:rPr>
+        <w:t xml:space="preserve">[Z]</w:t>
+      </w:r>
+      <w:r>
+        <w:t xml:space="preserve"> SDOF SHM benchmark Zenodo sayfası (doi:10.5281/zenodo.17900302)</w:t>
+      </w:r>
+    </w:p>
+    <w:p>
+      <w:pPr>
+        <w:pStyle w:val="ListParagraph"/>
+        <w:numPr>
+          <w:ilvl w:val="0"/>
+          <w:numId w:val="2"/>
+        </w:numPr>
+        <w:spacing w:after="60" w:line="276"/>
+      </w:pPr>
+      <w:r>
+        <w:rPr>
+          <w:b/>
+          <w:bCs/>
+        </w:rPr>
+        <w:t xml:space="preserve">[N]</w:t>
+      </w:r>
+      <w:r>
+        <w:t xml:space="preserve"> SDOF veri setiyle birlikte gelen notebook'lar (</w:t>
+      </w:r>
+      <w:r>
+        <w:rPr>
+          <w:rFonts w:ascii="Consolas" w:cs="Consolas" w:eastAsia="Consolas" w:hAnsi="Consolas"/>
+          <w:color w:val="7A2E0E"/>
+          <w:sz w:val="19"/>
+          <w:szCs w:val="19"/>
+        </w:rPr>
+        <w:t xml:space="preserve">dataset/code/*.ipynb</w:t>
+      </w:r>
+      <w:r>
+        <w:t xml:space="preserve">)</w:t>
+      </w:r>
+    </w:p>
+    <w:p>
+      <w:pPr>
         <w:pStyle w:val="Heading1"/>
       </w:pPr>
       <w:r>
-        <w:t xml:space="preserve">1. İki veri seti, iki ayrı dünya</w:t>
+        <w:t xml:space="preserve">1. İki veri seti</w:t>
       </w:r>
     </w:p>
     <w:p>
@@ -334,7 +435,7 @@
                 <w:sz w:val="19"/>
                 <w:szCs w:val="19"/>
               </w:rPr>
-              <w:t xml:space="preserve"> köprü, ABD, 2008</w:t>
+              <w:t xml:space="preserve"> köprü ölçümü, 2008 [V][M]</w:t>
             </w:r>
           </w:p>
         </w:tc>
@@ -365,14 +466,14 @@
                 <w:sz w:val="19"/>
                 <w:szCs w:val="19"/>
               </w:rPr>
-              <w:t xml:space="preserve">Bilgisayar simülasyonu</w:t>
-            </w:r>
-            <w:r>
-              <w:rPr>
-                <w:sz w:val="19"/>
-                <w:szCs w:val="19"/>
-              </w:rPr>
-              <w:t xml:space="preserve"> (sayısal model)</w:t>
+              <w:t xml:space="preserve">Sayısal simülasyon</w:t>
+            </w:r>
+            <w:r>
+              <w:rPr>
+                <w:sz w:val="19"/>
+                <w:szCs w:val="19"/>
+              </w:rPr>
+              <w:t xml:space="preserve"> [Z]</w:t>
             </w:r>
           </w:p>
         </w:tc>
@@ -432,7 +533,7 @@
                 <w:sz w:val="19"/>
                 <w:szCs w:val="19"/>
               </w:rPr>
-              <w:t xml:space="preserve">13.7 m çelik kirişli betonarme tabliyeli köprü</w:t>
+              <w:t xml:space="preserve">13.716 m açıklıklı, çelik kirişli betonarme tabliyeli köprü [M]</w:t>
             </w:r>
           </w:p>
         </w:tc>
@@ -461,7 +562,7 @@
                 <w:sz w:val="19"/>
                 <w:szCs w:val="19"/>
               </w:rPr>
-              <w:t xml:space="preserve">Ankastre çelik kiriş, tek serbestlik dereceli (SDOF) model</w:t>
+              <w:t xml:space="preserve">Ankastre (fixed–fixed) çelik kiriş, tek serbestlik dereceli model [Z]</w:t>
             </w:r>
           </w:p>
         </w:tc>
@@ -521,7 +622,7 @@
                 <w:sz w:val="19"/>
                 <w:szCs w:val="19"/>
               </w:rPr>
-              <w:t xml:space="preserve">30 ivmeölçer × 2 yön (y yanal, z düşey) + 20 strain</w:t>
+              <w:t xml:space="preserve">30 çift eksenli ivmeölçer (y, z) [V] + 20 strain ölçer [V][M]</w:t>
             </w:r>
           </w:p>
         </w:tc>
@@ -545,6 +646,518 @@
             <w:pPr>
               <w:spacing w:after="0" w:line="252"/>
             </w:pPr>
+            <w:r>
+              <w:rPr>
+                <w:sz w:val="19"/>
+                <w:szCs w:val="19"/>
+              </w:rPr>
+              <w:t xml:space="preserve">Tek sensör [Z]</w:t>
+            </w:r>
+          </w:p>
+        </w:tc>
+      </w:tr>
+      <w:tr>
+        <w:tc>
+          <w:tcPr>
+            <w:tcW w:type="dxa" w:w="1600"/>
+            <w:tcBorders>
+              <w:top w:val="single" w:color="BFC7D1" w:sz="4"/>
+              <w:left w:val="single" w:color="BFC7D1" w:sz="4"/>
+              <w:bottom w:val="single" w:color="BFC7D1" w:sz="4"/>
+              <w:right w:val="single" w:color="BFC7D1" w:sz="4"/>
+            </w:tcBorders>
+            <w:tcMar>
+              <w:top w:type="dxa" w:w="60"/>
+              <w:left w:type="dxa" w:w="100"/>
+              <w:bottom w:type="dxa" w:w="60"/>
+              <w:right w:type="dxa" w:w="100"/>
+            </w:tcMar>
+          </w:tcPr>
+          <w:p>
+            <w:pPr>
+              <w:spacing w:after="0" w:line="252"/>
+            </w:pPr>
+            <w:r>
+              <w:rPr>
+                <w:sz w:val="19"/>
+                <w:szCs w:val="19"/>
+              </w:rPr>
+              <w:t xml:space="preserve">Süre</w:t>
+            </w:r>
+          </w:p>
+        </w:tc>
+        <w:tc>
+          <w:tcPr>
+            <w:tcW w:type="dxa" w:w="3900"/>
+            <w:tcBorders>
+              <w:top w:val="single" w:color="BFC7D1" w:sz="4"/>
+              <w:left w:val="single" w:color="BFC7D1" w:sz="4"/>
+              <w:bottom w:val="single" w:color="BFC7D1" w:sz="4"/>
+              <w:right w:val="single" w:color="BFC7D1" w:sz="4"/>
+            </w:tcBorders>
+            <w:tcMar>
+              <w:top w:type="dxa" w:w="60"/>
+              <w:left w:type="dxa" w:w="100"/>
+              <w:bottom w:type="dxa" w:w="60"/>
+              <w:right w:type="dxa" w:w="100"/>
+            </w:tcMar>
+          </w:tcPr>
+          <w:p>
+            <w:pPr>
+              <w:spacing w:after="0" w:line="252"/>
+            </w:pPr>
+            <w:r>
+              <w:rPr>
+                <w:sz w:val="19"/>
+                <w:szCs w:val="19"/>
+              </w:rPr>
+              <w:t xml:space="preserve">Ölçümler 3 saatlik bir zaman aralığında alınmış [M]</w:t>
+            </w:r>
+          </w:p>
+        </w:tc>
+        <w:tc>
+          <w:tcPr>
+            <w:tcW w:type="dxa" w:w="4138"/>
+            <w:tcBorders>
+              <w:top w:val="single" w:color="BFC7D1" w:sz="4"/>
+              <w:left w:val="single" w:color="BFC7D1" w:sz="4"/>
+              <w:bottom w:val="single" w:color="BFC7D1" w:sz="4"/>
+              <w:right w:val="single" w:color="BFC7D1" w:sz="4"/>
+            </w:tcBorders>
+            <w:tcMar>
+              <w:top w:type="dxa" w:w="60"/>
+              <w:left w:type="dxa" w:w="100"/>
+              <w:bottom w:type="dxa" w:w="60"/>
+              <w:right w:type="dxa" w:w="100"/>
+            </w:tcMar>
+          </w:tcPr>
+          <w:p>
+            <w:pPr>
+              <w:spacing w:after="0" w:line="252"/>
+            </w:pPr>
+            <w:r>
+              <w:rPr>
+                <w:sz w:val="19"/>
+                <w:szCs w:val="19"/>
+              </w:rPr>
+              <w:t xml:space="preserve">3 yıl, saatlik kayıt [Z]</w:t>
+            </w:r>
+          </w:p>
+        </w:tc>
+      </w:tr>
+      <w:tr>
+        <w:tc>
+          <w:tcPr>
+            <w:tcW w:type="dxa" w:w="1600"/>
+            <w:tcBorders>
+              <w:top w:val="single" w:color="BFC7D1" w:sz="4"/>
+              <w:left w:val="single" w:color="BFC7D1" w:sz="4"/>
+              <w:bottom w:val="single" w:color="BFC7D1" w:sz="4"/>
+              <w:right w:val="single" w:color="BFC7D1" w:sz="4"/>
+            </w:tcBorders>
+            <w:tcMar>
+              <w:top w:type="dxa" w:w="60"/>
+              <w:left w:type="dxa" w:w="100"/>
+              <w:bottom w:type="dxa" w:w="60"/>
+              <w:right w:type="dxa" w:w="100"/>
+            </w:tcMar>
+          </w:tcPr>
+          <w:p>
+            <w:pPr>
+              <w:spacing w:after="0" w:line="252"/>
+            </w:pPr>
+            <w:r>
+              <w:rPr>
+                <w:sz w:val="19"/>
+                <w:szCs w:val="19"/>
+              </w:rPr>
+              <w:t xml:space="preserve">Kayıt sayısı</w:t>
+            </w:r>
+          </w:p>
+        </w:tc>
+        <w:tc>
+          <w:tcPr>
+            <w:tcW w:type="dxa" w:w="3900"/>
+            <w:tcBorders>
+              <w:top w:val="single" w:color="BFC7D1" w:sz="4"/>
+              <w:left w:val="single" w:color="BFC7D1" w:sz="4"/>
+              <w:bottom w:val="single" w:color="BFC7D1" w:sz="4"/>
+              <w:right w:val="single" w:color="BFC7D1" w:sz="4"/>
+            </w:tcBorders>
+            <w:tcMar>
+              <w:top w:type="dxa" w:w="60"/>
+              <w:left w:type="dxa" w:w="100"/>
+              <w:bottom w:type="dxa" w:w="60"/>
+              <w:right w:type="dxa" w:w="100"/>
+            </w:tcMar>
+          </w:tcPr>
+          <w:p>
+            <w:pPr>
+              <w:spacing w:after="0" w:line="252"/>
+            </w:pPr>
+            <w:r>
+              <w:rPr>
+                <w:sz w:val="19"/>
+                <w:szCs w:val="19"/>
+              </w:rPr>
+              <w:t xml:space="preserve">25 ivme kaydı, her biri ~90 s [V]</w:t>
+            </w:r>
+          </w:p>
+        </w:tc>
+        <w:tc>
+          <w:tcPr>
+            <w:tcW w:type="dxa" w:w="4138"/>
+            <w:tcBorders>
+              <w:top w:val="single" w:color="BFC7D1" w:sz="4"/>
+              <w:left w:val="single" w:color="BFC7D1" w:sz="4"/>
+              <w:bottom w:val="single" w:color="BFC7D1" w:sz="4"/>
+              <w:right w:val="single" w:color="BFC7D1" w:sz="4"/>
+            </w:tcBorders>
+            <w:tcMar>
+              <w:top w:type="dxa" w:w="60"/>
+              <w:left w:type="dxa" w:w="100"/>
+              <w:bottom w:type="dxa" w:w="60"/>
+              <w:right w:type="dxa" w:w="100"/>
+            </w:tcMar>
+          </w:tcPr>
+          <w:p>
+            <w:pPr>
+              <w:spacing w:after="0" w:line="252"/>
+            </w:pPr>
+            <w:r>
+              <w:rPr>
+                <w:sz w:val="19"/>
+                <w:szCs w:val="19"/>
+              </w:rPr>
+              <w:t xml:space="preserve">125 134 ivme dosyası, her biri 3 dk [V][Z]</w:t>
+            </w:r>
+          </w:p>
+        </w:tc>
+      </w:tr>
+      <w:tr>
+        <w:tc>
+          <w:tcPr>
+            <w:tcW w:type="dxa" w:w="1600"/>
+            <w:tcBorders>
+              <w:top w:val="single" w:color="BFC7D1" w:sz="4"/>
+              <w:left w:val="single" w:color="BFC7D1" w:sz="4"/>
+              <w:bottom w:val="single" w:color="BFC7D1" w:sz="4"/>
+              <w:right w:val="single" w:color="BFC7D1" w:sz="4"/>
+            </w:tcBorders>
+            <w:tcMar>
+              <w:top w:type="dxa" w:w="60"/>
+              <w:left w:type="dxa" w:w="100"/>
+              <w:bottom w:type="dxa" w:w="60"/>
+              <w:right w:type="dxa" w:w="100"/>
+            </w:tcMar>
+          </w:tcPr>
+          <w:p>
+            <w:pPr>
+              <w:spacing w:after="0" w:line="252"/>
+            </w:pPr>
+            <w:r>
+              <w:rPr>
+                <w:sz w:val="19"/>
+                <w:szCs w:val="19"/>
+              </w:rPr>
+              <w:t xml:space="preserve">Örnekleme</w:t>
+            </w:r>
+          </w:p>
+        </w:tc>
+        <w:tc>
+          <w:tcPr>
+            <w:tcW w:type="dxa" w:w="3900"/>
+            <w:tcBorders>
+              <w:top w:val="single" w:color="BFC7D1" w:sz="4"/>
+              <w:left w:val="single" w:color="BFC7D1" w:sz="4"/>
+              <w:bottom w:val="single" w:color="BFC7D1" w:sz="4"/>
+              <w:right w:val="single" w:color="BFC7D1" w:sz="4"/>
+            </w:tcBorders>
+            <w:tcMar>
+              <w:top w:type="dxa" w:w="60"/>
+              <w:left w:type="dxa" w:w="100"/>
+              <w:bottom w:type="dxa" w:w="60"/>
+              <w:right w:type="dxa" w:w="100"/>
+            </w:tcMar>
+          </w:tcPr>
+          <w:p>
+            <w:pPr>
+              <w:spacing w:after="0" w:line="252"/>
+            </w:pPr>
+            <w:r>
+              <w:rPr>
+                <w:sz w:val="19"/>
+                <w:szCs w:val="19"/>
+              </w:rPr>
+              <w:t xml:space="preserve">128 Hz [V]</w:t>
+            </w:r>
+          </w:p>
+        </w:tc>
+        <w:tc>
+          <w:tcPr>
+            <w:tcW w:type="dxa" w:w="4138"/>
+            <w:tcBorders>
+              <w:top w:val="single" w:color="BFC7D1" w:sz="4"/>
+              <w:left w:val="single" w:color="BFC7D1" w:sz="4"/>
+              <w:bottom w:val="single" w:color="BFC7D1" w:sz="4"/>
+              <w:right w:val="single" w:color="BFC7D1" w:sz="4"/>
+            </w:tcBorders>
+            <w:tcMar>
+              <w:top w:type="dxa" w:w="60"/>
+              <w:left w:type="dxa" w:w="100"/>
+              <w:bottom w:type="dxa" w:w="60"/>
+              <w:right w:type="dxa" w:w="100"/>
+            </w:tcMar>
+          </w:tcPr>
+          <w:p>
+            <w:pPr>
+              <w:spacing w:after="0" w:line="252"/>
+            </w:pPr>
+            <w:r>
+              <w:rPr>
+                <w:sz w:val="19"/>
+                <w:szCs w:val="19"/>
+              </w:rPr>
+              <w:t xml:space="preserve">100 Hz [Z]</w:t>
+            </w:r>
+          </w:p>
+        </w:tc>
+      </w:tr>
+      <w:tr>
+        <w:tc>
+          <w:tcPr>
+            <w:tcW w:type="dxa" w:w="1600"/>
+            <w:tcBorders>
+              <w:top w:val="single" w:color="BFC7D1" w:sz="4"/>
+              <w:left w:val="single" w:color="BFC7D1" w:sz="4"/>
+              <w:bottom w:val="single" w:color="BFC7D1" w:sz="4"/>
+              <w:right w:val="single" w:color="BFC7D1" w:sz="4"/>
+            </w:tcBorders>
+            <w:tcMar>
+              <w:top w:type="dxa" w:w="60"/>
+              <w:left w:type="dxa" w:w="100"/>
+              <w:bottom w:type="dxa" w:w="60"/>
+              <w:right w:type="dxa" w:w="100"/>
+            </w:tcMar>
+          </w:tcPr>
+          <w:p>
+            <w:pPr>
+              <w:spacing w:after="0" w:line="252"/>
+            </w:pPr>
+            <w:r>
+              <w:rPr>
+                <w:sz w:val="19"/>
+                <w:szCs w:val="19"/>
+              </w:rPr>
+              <w:t xml:space="preserve">Hasar</w:t>
+            </w:r>
+          </w:p>
+        </w:tc>
+        <w:tc>
+          <w:tcPr>
+            <w:tcW w:type="dxa" w:w="3900"/>
+            <w:tcBorders>
+              <w:top w:val="single" w:color="BFC7D1" w:sz="4"/>
+              <w:left w:val="single" w:color="BFC7D1" w:sz="4"/>
+              <w:bottom w:val="single" w:color="BFC7D1" w:sz="4"/>
+              <w:right w:val="single" w:color="BFC7D1" w:sz="4"/>
+            </w:tcBorders>
+            <w:tcMar>
+              <w:top w:type="dxa" w:w="60"/>
+              <w:left w:type="dxa" w:w="100"/>
+              <w:bottom w:type="dxa" w:w="60"/>
+              <w:right w:type="dxa" w:w="100"/>
+            </w:tcMar>
+          </w:tcPr>
+          <w:p>
+            <w:pPr>
+              <w:spacing w:after="0" w:line="252"/>
+            </w:pPr>
+            <w:r>
+              <w:rPr>
+                <w:sz w:val="19"/>
+                <w:szCs w:val="19"/>
+              </w:rPr>
+              <w:t xml:space="preserve">Mesnette kriko ile yer değiştirme, diyafram bulonlarının sökülmesi [V][M]</w:t>
+            </w:r>
+          </w:p>
+        </w:tc>
+        <w:tc>
+          <w:tcPr>
+            <w:tcW w:type="dxa" w:w="4138"/>
+            <w:tcBorders>
+              <w:top w:val="single" w:color="BFC7D1" w:sz="4"/>
+              <w:left w:val="single" w:color="BFC7D1" w:sz="4"/>
+              <w:bottom w:val="single" w:color="BFC7D1" w:sz="4"/>
+              <w:right w:val="single" w:color="BFC7D1" w:sz="4"/>
+            </w:tcBorders>
+            <w:tcMar>
+              <w:top w:type="dxa" w:w="60"/>
+              <w:left w:type="dxa" w:w="100"/>
+              <w:bottom w:type="dxa" w:w="60"/>
+              <w:right w:type="dxa" w:w="100"/>
+            </w:tcMar>
+          </w:tcPr>
+          <w:p>
+            <w:pPr>
+              <w:spacing w:after="0" w:line="252"/>
+            </w:pPr>
+            <w:r>
+              <w:rPr>
+                <w:sz w:val="19"/>
+                <w:szCs w:val="19"/>
+              </w:rPr>
+              <w:t xml:space="preserve">Ani rijitlik kaybı, yavaş (korozyon) hasar, sensör arızaları [Z]</w:t>
+            </w:r>
+          </w:p>
+        </w:tc>
+      </w:tr>
+      <w:tr>
+        <w:tc>
+          <w:tcPr>
+            <w:tcW w:type="dxa" w:w="1600"/>
+            <w:tcBorders>
+              <w:top w:val="single" w:color="BFC7D1" w:sz="4"/>
+              <w:left w:val="single" w:color="BFC7D1" w:sz="4"/>
+              <w:bottom w:val="single" w:color="BFC7D1" w:sz="4"/>
+              <w:right w:val="single" w:color="BFC7D1" w:sz="4"/>
+            </w:tcBorders>
+            <w:tcMar>
+              <w:top w:type="dxa" w:w="60"/>
+              <w:left w:type="dxa" w:w="100"/>
+              <w:bottom w:type="dxa" w:w="60"/>
+              <w:right w:type="dxa" w:w="100"/>
+            </w:tcMar>
+          </w:tcPr>
+          <w:p>
+            <w:pPr>
+              <w:spacing w:after="0" w:line="252"/>
+            </w:pPr>
+            <w:r>
+              <w:rPr>
+                <w:sz w:val="19"/>
+                <w:szCs w:val="19"/>
+              </w:rPr>
+              <w:t xml:space="preserve">Çevresel koşul</w:t>
+            </w:r>
+          </w:p>
+        </w:tc>
+        <w:tc>
+          <w:tcPr>
+            <w:tcW w:type="dxa" w:w="3900"/>
+            <w:tcBorders>
+              <w:top w:val="single" w:color="BFC7D1" w:sz="4"/>
+              <w:left w:val="single" w:color="BFC7D1" w:sz="4"/>
+              <w:bottom w:val="single" w:color="BFC7D1" w:sz="4"/>
+              <w:right w:val="single" w:color="BFC7D1" w:sz="4"/>
+            </w:tcBorders>
+            <w:tcMar>
+              <w:top w:type="dxa" w:w="60"/>
+              <w:left w:type="dxa" w:w="100"/>
+              <w:bottom w:type="dxa" w:w="60"/>
+              <w:right w:type="dxa" w:w="100"/>
+            </w:tcMar>
+          </w:tcPr>
+          <w:p>
+            <w:pPr>
+              <w:spacing w:after="0" w:line="252"/>
+            </w:pPr>
+            <w:r>
+              <w:rPr>
+                <w:sz w:val="19"/>
+                <w:szCs w:val="19"/>
+              </w:rPr>
+              <w:t xml:space="preserve">Ölçüm süresince sıcaklık değişimi &lt;3 °C [M]</w:t>
+            </w:r>
+          </w:p>
+        </w:tc>
+        <w:tc>
+          <w:tcPr>
+            <w:tcW w:type="dxa" w:w="4138"/>
+            <w:tcBorders>
+              <w:top w:val="single" w:color="BFC7D1" w:sz="4"/>
+              <w:left w:val="single" w:color="BFC7D1" w:sz="4"/>
+              <w:bottom w:val="single" w:color="BFC7D1" w:sz="4"/>
+              <w:right w:val="single" w:color="BFC7D1" w:sz="4"/>
+            </w:tcBorders>
+            <w:tcMar>
+              <w:top w:type="dxa" w:w="60"/>
+              <w:left w:type="dxa" w:w="100"/>
+              <w:bottom w:type="dxa" w:w="60"/>
+              <w:right w:type="dxa" w:w="100"/>
+            </w:tcMar>
+          </w:tcPr>
+          <w:p>
+            <w:pPr>
+              <w:spacing w:after="0" w:line="252"/>
+            </w:pPr>
+            <w:r>
+              <w:rPr>
+                <w:sz w:val="19"/>
+                <w:szCs w:val="19"/>
+              </w:rPr>
+              <w:t xml:space="preserve">Sıcaklık ve trafik yükü değişkenliği modele dahil [Z]</w:t>
+            </w:r>
+          </w:p>
+        </w:tc>
+      </w:tr>
+      <w:tr>
+        <w:tc>
+          <w:tcPr>
+            <w:tcW w:type="dxa" w:w="1600"/>
+            <w:tcBorders>
+              <w:top w:val="single" w:color="BFC7D1" w:sz="4"/>
+              <w:left w:val="single" w:color="BFC7D1" w:sz="4"/>
+              <w:bottom w:val="single" w:color="BFC7D1" w:sz="4"/>
+              <w:right w:val="single" w:color="BFC7D1" w:sz="4"/>
+            </w:tcBorders>
+            <w:tcMar>
+              <w:top w:type="dxa" w:w="60"/>
+              <w:left w:type="dxa" w:w="100"/>
+              <w:bottom w:type="dxa" w:w="60"/>
+              <w:right w:type="dxa" w:w="100"/>
+            </w:tcMar>
+          </w:tcPr>
+          <w:p>
+            <w:pPr>
+              <w:spacing w:after="0" w:line="252"/>
+            </w:pPr>
+            <w:r>
+              <w:rPr>
+                <w:sz w:val="19"/>
+                <w:szCs w:val="19"/>
+              </w:rPr>
+              <w:t xml:space="preserve">Format</w:t>
+            </w:r>
+          </w:p>
+        </w:tc>
+        <w:tc>
+          <w:tcPr>
+            <w:tcW w:type="dxa" w:w="3900"/>
+            <w:tcBorders>
+              <w:top w:val="single" w:color="BFC7D1" w:sz="4"/>
+              <w:left w:val="single" w:color="BFC7D1" w:sz="4"/>
+              <w:bottom w:val="single" w:color="BFC7D1" w:sz="4"/>
+              <w:right w:val="single" w:color="BFC7D1" w:sz="4"/>
+            </w:tcBorders>
+            <w:tcMar>
+              <w:top w:type="dxa" w:w="60"/>
+              <w:left w:type="dxa" w:w="100"/>
+              <w:bottom w:type="dxa" w:w="60"/>
+              <w:right w:type="dxa" w:w="100"/>
+            </w:tcMar>
+          </w:tcPr>
+          <w:p>
+            <w:pPr>
+              <w:spacing w:after="0" w:line="252"/>
+            </w:pPr>
+            <w:r>
+              <w:rPr>
+                <w:sz w:val="19"/>
+                <w:szCs w:val="19"/>
+              </w:rPr>
+              <w:t xml:space="preserve">Tek bir </w:t>
+            </w:r>
             <w:r>
               <w:rPr>
                 <w:b/>
@@ -552,74 +1165,14 @@
                 <w:sz w:val="19"/>
                 <w:szCs w:val="19"/>
               </w:rPr>
-              <w:t xml:space="preserve">Tek</w:t>
-            </w:r>
-            <w:r>
-              <w:rPr>
-                <w:sz w:val="19"/>
-                <w:szCs w:val="19"/>
-              </w:rPr>
-              <w:t xml:space="preserve"> ivmeölçer, tek yön</w:t>
-            </w:r>
-          </w:p>
-        </w:tc>
-      </w:tr>
-      <w:tr>
-        <w:tc>
-          <w:tcPr>
-            <w:tcW w:type="dxa" w:w="1600"/>
-            <w:tcBorders>
-              <w:top w:val="single" w:color="BFC7D1" w:sz="4"/>
-              <w:left w:val="single" w:color="BFC7D1" w:sz="4"/>
-              <w:bottom w:val="single" w:color="BFC7D1" w:sz="4"/>
-              <w:right w:val="single" w:color="BFC7D1" w:sz="4"/>
-            </w:tcBorders>
-            <w:tcMar>
-              <w:top w:type="dxa" w:w="60"/>
-              <w:left w:type="dxa" w:w="100"/>
-              <w:bottom w:type="dxa" w:w="60"/>
-              <w:right w:type="dxa" w:w="100"/>
-            </w:tcMar>
-          </w:tcPr>
-          <w:p>
-            <w:pPr>
-              <w:spacing w:after="0" w:line="252"/>
-            </w:pPr>
-            <w:r>
-              <w:rPr>
-                <w:sz w:val="19"/>
-                <w:szCs w:val="19"/>
-              </w:rPr>
-              <w:t xml:space="preserve">Süre</w:t>
-            </w:r>
-          </w:p>
-        </w:tc>
-        <w:tc>
-          <w:tcPr>
-            <w:tcW w:type="dxa" w:w="3900"/>
-            <w:tcBorders>
-              <w:top w:val="single" w:color="BFC7D1" w:sz="4"/>
-              <w:left w:val="single" w:color="BFC7D1" w:sz="4"/>
-              <w:bottom w:val="single" w:color="BFC7D1" w:sz="4"/>
-              <w:right w:val="single" w:color="BFC7D1" w:sz="4"/>
-            </w:tcBorders>
-            <w:tcMar>
-              <w:top w:type="dxa" w:w="60"/>
-              <w:left w:type="dxa" w:w="100"/>
-              <w:bottom w:type="dxa" w:w="60"/>
-              <w:right w:type="dxa" w:w="100"/>
-            </w:tcMar>
-          </w:tcPr>
-          <w:p>
-            <w:pPr>
-              <w:spacing w:after="0" w:line="252"/>
-            </w:pPr>
-            <w:r>
-              <w:rPr>
-                <w:sz w:val="19"/>
-                <w:szCs w:val="19"/>
-              </w:rPr>
-              <w:t xml:space="preserve">Tek öğleden sonra, 3 saat</w:t>
+              <w:t xml:space="preserve">hiyerarşik h5</w:t>
+            </w:r>
+            <w:r>
+              <w:rPr>
+                <w:sz w:val="19"/>
+                <w:szCs w:val="19"/>
+              </w:rPr>
+              <w:t xml:space="preserve"> dosyası [V]</w:t>
             </w:r>
           </w:p>
         </w:tc>
@@ -643,6 +1196,13 @@
             <w:pPr>
               <w:spacing w:after="0" w:line="252"/>
             </w:pPr>
+            <w:r>
+              <w:rPr>
+                <w:sz w:val="19"/>
+                <w:szCs w:val="19"/>
+              </w:rPr>
+              <w:t xml:space="preserve">Saat başına </w:t>
+            </w:r>
             <w:r>
               <w:rPr>
                 <w:b/>
@@ -650,364 +1210,15 @@
                 <w:sz w:val="19"/>
                 <w:szCs w:val="19"/>
               </w:rPr>
-              <w:t xml:space="preserve">3 yıl</w:t>
-            </w:r>
-            <w:r>
-              <w:rPr>
-                <w:sz w:val="19"/>
-                <w:szCs w:val="19"/>
-              </w:rPr>
-              <w:t xml:space="preserve">, saatte bir kayıt</w:t>
-            </w:r>
-          </w:p>
-        </w:tc>
-      </w:tr>
-      <w:tr>
-        <w:tc>
-          <w:tcPr>
-            <w:tcW w:type="dxa" w:w="1600"/>
-            <w:tcBorders>
-              <w:top w:val="single" w:color="BFC7D1" w:sz="4"/>
-              <w:left w:val="single" w:color="BFC7D1" w:sz="4"/>
-              <w:bottom w:val="single" w:color="BFC7D1" w:sz="4"/>
-              <w:right w:val="single" w:color="BFC7D1" w:sz="4"/>
-            </w:tcBorders>
-            <w:tcMar>
-              <w:top w:type="dxa" w:w="60"/>
-              <w:left w:type="dxa" w:w="100"/>
-              <w:bottom w:type="dxa" w:w="60"/>
-              <w:right w:type="dxa" w:w="100"/>
-            </w:tcMar>
-          </w:tcPr>
-          <w:p>
-            <w:pPr>
-              <w:spacing w:after="0" w:line="252"/>
-            </w:pPr>
-            <w:r>
-              <w:rPr>
-                <w:sz w:val="19"/>
-                <w:szCs w:val="19"/>
-              </w:rPr>
-              <w:t xml:space="preserve">Kayıt sayısı</w:t>
-            </w:r>
-          </w:p>
-        </w:tc>
-        <w:tc>
-          <w:tcPr>
-            <w:tcW w:type="dxa" w:w="3900"/>
-            <w:tcBorders>
-              <w:top w:val="single" w:color="BFC7D1" w:sz="4"/>
-              <w:left w:val="single" w:color="BFC7D1" w:sz="4"/>
-              <w:bottom w:val="single" w:color="BFC7D1" w:sz="4"/>
-              <w:right w:val="single" w:color="BFC7D1" w:sz="4"/>
-            </w:tcBorders>
-            <w:tcMar>
-              <w:top w:type="dxa" w:w="60"/>
-              <w:left w:type="dxa" w:w="100"/>
-              <w:bottom w:type="dxa" w:w="60"/>
-              <w:right w:type="dxa" w:w="100"/>
-            </w:tcMar>
-          </w:tcPr>
-          <w:p>
-            <w:pPr>
-              <w:spacing w:after="0" w:line="252"/>
-            </w:pPr>
-            <w:r>
-              <w:rPr>
-                <w:sz w:val="19"/>
-                <w:szCs w:val="19"/>
-              </w:rPr>
-              <w:t xml:space="preserve">25 kayıt (~90 s)</w:t>
-            </w:r>
-          </w:p>
-        </w:tc>
-        <w:tc>
-          <w:tcPr>
-            <w:tcW w:type="dxa" w:w="4138"/>
-            <w:tcBorders>
-              <w:top w:val="single" w:color="BFC7D1" w:sz="4"/>
-              <w:left w:val="single" w:color="BFC7D1" w:sz="4"/>
-              <w:bottom w:val="single" w:color="BFC7D1" w:sz="4"/>
-              <w:right w:val="single" w:color="BFC7D1" w:sz="4"/>
-            </w:tcBorders>
-            <w:tcMar>
-              <w:top w:type="dxa" w:w="60"/>
-              <w:left w:type="dxa" w:w="100"/>
-              <w:bottom w:type="dxa" w:w="60"/>
-              <w:right w:type="dxa" w:w="100"/>
-            </w:tcMar>
-          </w:tcPr>
-          <w:p>
-            <w:pPr>
-              <w:spacing w:after="0" w:line="252"/>
-            </w:pPr>
-            <w:r>
-              <w:rPr>
-                <w:sz w:val="19"/>
-                <w:szCs w:val="19"/>
-              </w:rPr>
-              <w:t xml:space="preserve">~125 000 kayıt (3 dk)</w:t>
-            </w:r>
-          </w:p>
-        </w:tc>
-      </w:tr>
-      <w:tr>
-        <w:tc>
-          <w:tcPr>
-            <w:tcW w:type="dxa" w:w="1600"/>
-            <w:tcBorders>
-              <w:top w:val="single" w:color="BFC7D1" w:sz="4"/>
-              <w:left w:val="single" w:color="BFC7D1" w:sz="4"/>
-              <w:bottom w:val="single" w:color="BFC7D1" w:sz="4"/>
-              <w:right w:val="single" w:color="BFC7D1" w:sz="4"/>
-            </w:tcBorders>
-            <w:tcMar>
-              <w:top w:type="dxa" w:w="60"/>
-              <w:left w:type="dxa" w:w="100"/>
-              <w:bottom w:type="dxa" w:w="60"/>
-              <w:right w:type="dxa" w:w="100"/>
-            </w:tcMar>
-          </w:tcPr>
-          <w:p>
-            <w:pPr>
-              <w:spacing w:after="0" w:line="252"/>
-            </w:pPr>
-            <w:r>
-              <w:rPr>
-                <w:sz w:val="19"/>
-                <w:szCs w:val="19"/>
-              </w:rPr>
-              <w:t xml:space="preserve">Örnekleme</w:t>
-            </w:r>
-          </w:p>
-        </w:tc>
-        <w:tc>
-          <w:tcPr>
-            <w:tcW w:type="dxa" w:w="3900"/>
-            <w:tcBorders>
-              <w:top w:val="single" w:color="BFC7D1" w:sz="4"/>
-              <w:left w:val="single" w:color="BFC7D1" w:sz="4"/>
-              <w:bottom w:val="single" w:color="BFC7D1" w:sz="4"/>
-              <w:right w:val="single" w:color="BFC7D1" w:sz="4"/>
-            </w:tcBorders>
-            <w:tcMar>
-              <w:top w:type="dxa" w:w="60"/>
-              <w:left w:type="dxa" w:w="100"/>
-              <w:bottom w:type="dxa" w:w="60"/>
-              <w:right w:type="dxa" w:w="100"/>
-            </w:tcMar>
-          </w:tcPr>
-          <w:p>
-            <w:pPr>
-              <w:spacing w:after="0" w:line="252"/>
-            </w:pPr>
-            <w:r>
-              <w:rPr>
-                <w:sz w:val="19"/>
-                <w:szCs w:val="19"/>
-              </w:rPr>
-              <w:t xml:space="preserve">128 Hz</w:t>
-            </w:r>
-          </w:p>
-        </w:tc>
-        <w:tc>
-          <w:tcPr>
-            <w:tcW w:type="dxa" w:w="4138"/>
-            <w:tcBorders>
-              <w:top w:val="single" w:color="BFC7D1" w:sz="4"/>
-              <w:left w:val="single" w:color="BFC7D1" w:sz="4"/>
-              <w:bottom w:val="single" w:color="BFC7D1" w:sz="4"/>
-              <w:right w:val="single" w:color="BFC7D1" w:sz="4"/>
-            </w:tcBorders>
-            <w:tcMar>
-              <w:top w:type="dxa" w:w="60"/>
-              <w:left w:type="dxa" w:w="100"/>
-              <w:bottom w:type="dxa" w:w="60"/>
-              <w:right w:type="dxa" w:w="100"/>
-            </w:tcMar>
-          </w:tcPr>
-          <w:p>
-            <w:pPr>
-              <w:spacing w:after="0" w:line="252"/>
-            </w:pPr>
-            <w:r>
-              <w:rPr>
-                <w:sz w:val="19"/>
-                <w:szCs w:val="19"/>
-              </w:rPr>
-              <w:t xml:space="preserve">100 Hz</w:t>
-            </w:r>
-          </w:p>
-        </w:tc>
-      </w:tr>
-      <w:tr>
-        <w:tc>
-          <w:tcPr>
-            <w:tcW w:type="dxa" w:w="1600"/>
-            <w:tcBorders>
-              <w:top w:val="single" w:color="BFC7D1" w:sz="4"/>
-              <w:left w:val="single" w:color="BFC7D1" w:sz="4"/>
-              <w:bottom w:val="single" w:color="BFC7D1" w:sz="4"/>
-              <w:right w:val="single" w:color="BFC7D1" w:sz="4"/>
-            </w:tcBorders>
-            <w:tcMar>
-              <w:top w:type="dxa" w:w="60"/>
-              <w:left w:type="dxa" w:w="100"/>
-              <w:bottom w:type="dxa" w:w="60"/>
-              <w:right w:type="dxa" w:w="100"/>
-            </w:tcMar>
-          </w:tcPr>
-          <w:p>
-            <w:pPr>
-              <w:spacing w:after="0" w:line="252"/>
-            </w:pPr>
-            <w:r>
-              <w:rPr>
-                <w:sz w:val="19"/>
-                <w:szCs w:val="19"/>
-              </w:rPr>
-              <w:t xml:space="preserve">Hasar</w:t>
-            </w:r>
-          </w:p>
-        </w:tc>
-        <w:tc>
-          <w:tcPr>
-            <w:tcW w:type="dxa" w:w="3900"/>
-            <w:tcBorders>
-              <w:top w:val="single" w:color="BFC7D1" w:sz="4"/>
-              <w:left w:val="single" w:color="BFC7D1" w:sz="4"/>
-              <w:bottom w:val="single" w:color="BFC7D1" w:sz="4"/>
-              <w:right w:val="single" w:color="BFC7D1" w:sz="4"/>
-            </w:tcBorders>
-            <w:tcMar>
-              <w:top w:type="dxa" w:w="60"/>
-              <w:left w:type="dxa" w:w="100"/>
-              <w:bottom w:type="dxa" w:w="60"/>
-              <w:right w:type="dxa" w:w="100"/>
-            </w:tcMar>
-          </w:tcPr>
-          <w:p>
-            <w:pPr>
-              <w:spacing w:after="0" w:line="252"/>
-            </w:pPr>
-            <w:r>
-              <w:rPr>
-                <w:sz w:val="19"/>
-                <w:szCs w:val="19"/>
-              </w:rPr>
-              <w:t xml:space="preserve">Gerçekten uygulanmış (kriko, bulon sökme)</w:t>
-            </w:r>
-          </w:p>
-        </w:tc>
-        <w:tc>
-          <w:tcPr>
-            <w:tcW w:type="dxa" w:w="4138"/>
-            <w:tcBorders>
-              <w:top w:val="single" w:color="BFC7D1" w:sz="4"/>
-              <w:left w:val="single" w:color="BFC7D1" w:sz="4"/>
-              <w:bottom w:val="single" w:color="BFC7D1" w:sz="4"/>
-              <w:right w:val="single" w:color="BFC7D1" w:sz="4"/>
-            </w:tcBorders>
-            <w:tcMar>
-              <w:top w:type="dxa" w:w="60"/>
-              <w:left w:type="dxa" w:w="100"/>
-              <w:bottom w:type="dxa" w:w="60"/>
-              <w:right w:type="dxa" w:w="100"/>
-            </w:tcMar>
-          </w:tcPr>
-          <w:p>
-            <w:pPr>
-              <w:spacing w:after="0" w:line="252"/>
-            </w:pPr>
-            <w:r>
-              <w:rPr>
-                <w:sz w:val="19"/>
-                <w:szCs w:val="19"/>
-              </w:rPr>
-              <w:t xml:space="preserve">Yazılımla verilmiş rijitlik kaybı, korozyon, sensör arızası</w:t>
-            </w:r>
-          </w:p>
-        </w:tc>
-      </w:tr>
-      <w:tr>
-        <w:tc>
-          <w:tcPr>
-            <w:tcW w:type="dxa" w:w="1600"/>
-            <w:tcBorders>
-              <w:top w:val="single" w:color="BFC7D1" w:sz="4"/>
-              <w:left w:val="single" w:color="BFC7D1" w:sz="4"/>
-              <w:bottom w:val="single" w:color="BFC7D1" w:sz="4"/>
-              <w:right w:val="single" w:color="BFC7D1" w:sz="4"/>
-            </w:tcBorders>
-            <w:tcMar>
-              <w:top w:type="dxa" w:w="60"/>
-              <w:left w:type="dxa" w:w="100"/>
-              <w:bottom w:type="dxa" w:w="60"/>
-              <w:right w:type="dxa" w:w="100"/>
-            </w:tcMar>
-          </w:tcPr>
-          <w:p>
-            <w:pPr>
-              <w:spacing w:after="0" w:line="252"/>
-            </w:pPr>
-            <w:r>
-              <w:rPr>
-                <w:sz w:val="19"/>
-                <w:szCs w:val="19"/>
-              </w:rPr>
-              <w:t xml:space="preserve">Çevresel etki</w:t>
-            </w:r>
-          </w:p>
-        </w:tc>
-        <w:tc>
-          <w:tcPr>
-            <w:tcW w:type="dxa" w:w="3900"/>
-            <w:tcBorders>
-              <w:top w:val="single" w:color="BFC7D1" w:sz="4"/>
-              <w:left w:val="single" w:color="BFC7D1" w:sz="4"/>
-              <w:bottom w:val="single" w:color="BFC7D1" w:sz="4"/>
-              <w:right w:val="single" w:color="BFC7D1" w:sz="4"/>
-            </w:tcBorders>
-            <w:tcMar>
-              <w:top w:type="dxa" w:w="60"/>
-              <w:left w:type="dxa" w:w="100"/>
-              <w:bottom w:type="dxa" w:w="60"/>
-              <w:right w:type="dxa" w:w="100"/>
-            </w:tcMar>
-          </w:tcPr>
-          <w:p>
-            <w:pPr>
-              <w:spacing w:after="0" w:line="252"/>
-            </w:pPr>
-            <w:r>
-              <w:rPr>
-                <w:sz w:val="19"/>
-                <w:szCs w:val="19"/>
-              </w:rPr>
-              <w:t xml:space="preserve">Yok sayılabilir (3 saatte &lt;3 °C değişim)</w:t>
-            </w:r>
-          </w:p>
-        </w:tc>
-        <w:tc>
-          <w:tcPr>
-            <w:tcW w:type="dxa" w:w="4138"/>
-            <w:tcBorders>
-              <w:top w:val="single" w:color="BFC7D1" w:sz="4"/>
-              <w:left w:val="single" w:color="BFC7D1" w:sz="4"/>
-              <w:bottom w:val="single" w:color="BFC7D1" w:sz="4"/>
-              <w:right w:val="single" w:color="BFC7D1" w:sz="4"/>
-            </w:tcBorders>
-            <w:tcMar>
-              <w:top w:type="dxa" w:w="60"/>
-              <w:left w:type="dxa" w:w="100"/>
-              <w:bottom w:type="dxa" w:w="60"/>
-              <w:right w:type="dxa" w:w="100"/>
-            </w:tcMar>
-          </w:tcPr>
-          <w:p>
-            <w:pPr>
-              <w:spacing w:after="0" w:line="252"/>
-            </w:pPr>
+              <w:t xml:space="preserve">küçük h5</w:t>
+            </w:r>
+            <w:r>
+              <w:rPr>
+                <w:sz w:val="19"/>
+                <w:szCs w:val="19"/>
+              </w:rPr>
+              <w:t xml:space="preserve"> dosyaları + </w:t>
+            </w:r>
             <w:r>
               <w:rPr>
                 <w:b/>
@@ -1015,143 +1226,6 @@
                 <w:sz w:val="19"/>
                 <w:szCs w:val="19"/>
               </w:rPr>
-              <w:t xml:space="preserve">Bilerek eklenmiş</w:t>
-            </w:r>
-            <w:r>
-              <w:rPr>
-                <w:sz w:val="19"/>
-                <w:szCs w:val="19"/>
-              </w:rPr>
-              <w:t xml:space="preserve"> (sıcaklık, trafik yükü)</w:t>
-            </w:r>
-          </w:p>
-        </w:tc>
-      </w:tr>
-      <w:tr>
-        <w:tc>
-          <w:tcPr>
-            <w:tcW w:type="dxa" w:w="1600"/>
-            <w:tcBorders>
-              <w:top w:val="single" w:color="BFC7D1" w:sz="4"/>
-              <w:left w:val="single" w:color="BFC7D1" w:sz="4"/>
-              <w:bottom w:val="single" w:color="BFC7D1" w:sz="4"/>
-              <w:right w:val="single" w:color="BFC7D1" w:sz="4"/>
-            </w:tcBorders>
-            <w:tcMar>
-              <w:top w:type="dxa" w:w="60"/>
-              <w:left w:type="dxa" w:w="100"/>
-              <w:bottom w:type="dxa" w:w="60"/>
-              <w:right w:type="dxa" w:w="100"/>
-            </w:tcMar>
-          </w:tcPr>
-          <w:p>
-            <w:pPr>
-              <w:spacing w:after="0" w:line="252"/>
-            </w:pPr>
-            <w:r>
-              <w:rPr>
-                <w:sz w:val="19"/>
-                <w:szCs w:val="19"/>
-              </w:rPr>
-              <w:t xml:space="preserve">Format</w:t>
-            </w:r>
-          </w:p>
-        </w:tc>
-        <w:tc>
-          <w:tcPr>
-            <w:tcW w:type="dxa" w:w="3900"/>
-            <w:tcBorders>
-              <w:top w:val="single" w:color="BFC7D1" w:sz="4"/>
-              <w:left w:val="single" w:color="BFC7D1" w:sz="4"/>
-              <w:bottom w:val="single" w:color="BFC7D1" w:sz="4"/>
-              <w:right w:val="single" w:color="BFC7D1" w:sz="4"/>
-            </w:tcBorders>
-            <w:tcMar>
-              <w:top w:type="dxa" w:w="60"/>
-              <w:left w:type="dxa" w:w="100"/>
-              <w:bottom w:type="dxa" w:w="60"/>
-              <w:right w:type="dxa" w:w="100"/>
-            </w:tcMar>
-          </w:tcPr>
-          <w:p>
-            <w:pPr>
-              <w:spacing w:after="0" w:line="252"/>
-            </w:pPr>
-            <w:r>
-              <w:rPr>
-                <w:sz w:val="19"/>
-                <w:szCs w:val="19"/>
-              </w:rPr>
-              <w:t xml:space="preserve">Tek bir </w:t>
-            </w:r>
-            <w:r>
-              <w:rPr>
-                <w:b/>
-                <w:bCs/>
-                <w:sz w:val="19"/>
-                <w:szCs w:val="19"/>
-              </w:rPr>
-              <w:t xml:space="preserve">hiyerarşik h5</w:t>
-            </w:r>
-            <w:r>
-              <w:rPr>
-                <w:sz w:val="19"/>
-                <w:szCs w:val="19"/>
-              </w:rPr>
-              <w:t xml:space="preserve"> dosyası</w:t>
-            </w:r>
-          </w:p>
-        </w:tc>
-        <w:tc>
-          <w:tcPr>
-            <w:tcW w:type="dxa" w:w="4138"/>
-            <w:tcBorders>
-              <w:top w:val="single" w:color="BFC7D1" w:sz="4"/>
-              <w:left w:val="single" w:color="BFC7D1" w:sz="4"/>
-              <w:bottom w:val="single" w:color="BFC7D1" w:sz="4"/>
-              <w:right w:val="single" w:color="BFC7D1" w:sz="4"/>
-            </w:tcBorders>
-            <w:tcMar>
-              <w:top w:type="dxa" w:w="60"/>
-              <w:left w:type="dxa" w:w="100"/>
-              <w:bottom w:type="dxa" w:w="60"/>
-              <w:right w:type="dxa" w:w="100"/>
-            </w:tcMar>
-          </w:tcPr>
-          <w:p>
-            <w:pPr>
-              <w:spacing w:after="0" w:line="252"/>
-            </w:pPr>
-            <w:r>
-              <w:rPr>
-                <w:sz w:val="19"/>
-                <w:szCs w:val="19"/>
-              </w:rPr>
-              <w:t xml:space="preserve">Saat başına </w:t>
-            </w:r>
-            <w:r>
-              <w:rPr>
-                <w:b/>
-                <w:bCs/>
-                <w:sz w:val="19"/>
-                <w:szCs w:val="19"/>
-              </w:rPr>
-              <w:t xml:space="preserve">küçük h5</w:t>
-            </w:r>
-            <w:r>
-              <w:rPr>
-                <w:sz w:val="19"/>
-                <w:szCs w:val="19"/>
-              </w:rPr>
-              <w:t xml:space="preserve"> dosyaları + </w:t>
-            </w:r>
-            <w:r>
-              <w:rPr>
-                <w:b/>
-                <w:bCs/>
-                <w:sz w:val="19"/>
-                <w:szCs w:val="19"/>
-              </w:rPr>
               <w:t xml:space="preserve">txt/csv</w:t>
             </w:r>
             <w:r>
@@ -1159,96 +1233,7 @@
                 <w:sz w:val="19"/>
                 <w:szCs w:val="19"/>
               </w:rPr>
-              <w:t xml:space="preserve"> tablolar</w:t>
-            </w:r>
-          </w:p>
-        </w:tc>
-      </w:tr>
-      <w:tr>
-        <w:tc>
-          <w:tcPr>
-            <w:tcW w:type="dxa" w:w="1600"/>
-            <w:tcBorders>
-              <w:top w:val="single" w:color="BFC7D1" w:sz="4"/>
-              <w:left w:val="single" w:color="BFC7D1" w:sz="4"/>
-              <w:bottom w:val="single" w:color="BFC7D1" w:sz="4"/>
-              <w:right w:val="single" w:color="BFC7D1" w:sz="4"/>
-            </w:tcBorders>
-            <w:tcMar>
-              <w:top w:type="dxa" w:w="60"/>
-              <w:left w:type="dxa" w:w="100"/>
-              <w:bottom w:type="dxa" w:w="60"/>
-              <w:right w:type="dxa" w:w="100"/>
-            </w:tcMar>
-          </w:tcPr>
-          <w:p>
-            <w:pPr>
-              <w:spacing w:after="0" w:line="252"/>
-            </w:pPr>
-            <w:r>
-              <w:rPr>
-                <w:sz w:val="19"/>
-                <w:szCs w:val="19"/>
-              </w:rPr>
-              <w:t xml:space="preserve">Güçlü yanı</w:t>
-            </w:r>
-          </w:p>
-        </w:tc>
-        <w:tc>
-          <w:tcPr>
-            <w:tcW w:type="dxa" w:w="3900"/>
-            <w:tcBorders>
-              <w:top w:val="single" w:color="BFC7D1" w:sz="4"/>
-              <w:left w:val="single" w:color="BFC7D1" w:sz="4"/>
-              <w:bottom w:val="single" w:color="BFC7D1" w:sz="4"/>
-              <w:right w:val="single" w:color="BFC7D1" w:sz="4"/>
-            </w:tcBorders>
-            <w:tcMar>
-              <w:top w:type="dxa" w:w="60"/>
-              <w:left w:type="dxa" w:w="100"/>
-              <w:bottom w:type="dxa" w:w="60"/>
-              <w:right w:type="dxa" w:w="100"/>
-            </w:tcMar>
-          </w:tcPr>
-          <w:p>
-            <w:pPr>
-              <w:spacing w:after="0" w:line="252"/>
-            </w:pPr>
-            <w:r>
-              <w:rPr>
-                <w:sz w:val="19"/>
-                <w:szCs w:val="19"/>
-              </w:rPr>
-              <w:t xml:space="preserve">Gerçek ölçüm, çok sensör</w:t>
-            </w:r>
-          </w:p>
-        </w:tc>
-        <w:tc>
-          <w:tcPr>
-            <w:tcW w:type="dxa" w:w="4138"/>
-            <w:tcBorders>
-              <w:top w:val="single" w:color="BFC7D1" w:sz="4"/>
-              <w:left w:val="single" w:color="BFC7D1" w:sz="4"/>
-              <w:bottom w:val="single" w:color="BFC7D1" w:sz="4"/>
-              <w:right w:val="single" w:color="BFC7D1" w:sz="4"/>
-            </w:tcBorders>
-            <w:tcMar>
-              <w:top w:type="dxa" w:w="60"/>
-              <w:left w:type="dxa" w:w="100"/>
-              <w:bottom w:type="dxa" w:w="60"/>
-              <w:right w:type="dxa" w:w="100"/>
-            </w:tcMar>
-          </w:tcPr>
-          <w:p>
-            <w:pPr>
-              <w:spacing w:after="0" w:line="252"/>
-            </w:pPr>
-            <w:r>
-              <w:rPr>
-                <w:sz w:val="19"/>
-                <w:szCs w:val="19"/>
-              </w:rPr>
-              <w:t xml:space="preserve">Çok veri, sıcaklık etkisi var, yanlış alarm analizi için ideal</w:t>
+              <w:t xml:space="preserve"> tablolar [V]</w:t>
             </w:r>
           </w:p>
         </w:tc>
@@ -1261,69 +1246,49 @@
     </w:p>
     <w:p>
       <w:pPr>
-        <w:pBdr>
-          <w:left w:val="single" w:color="E69500" w:sz="18" w:space="6"/>
-        </w:pBdr>
-        <w:shd w:fill="FFF4E5" w:color="auto" w:val="clear"/>
-        <w:spacing w:after="160" w:before="80" w:line="276"/>
-        <w:ind w:left="140" w:right="140"/>
-      </w:pPr>
+        <w:pStyle w:val="Heading1"/>
+      </w:pPr>
+      <w:r>
+        <w:t xml:space="preserve">2. SDOF'un üç klasörü</w:t>
+      </w:r>
+    </w:p>
+    <w:p>
+      <w:pPr>
+        <w:spacing w:after="120" w:line="288"/>
+        <w:jc w:val="both"/>
+      </w:pPr>
+      <w:r>
+        <w:t xml:space="preserve">Bu üç klasör tek bir veri setinin parçaları. Veri setinin yazarları simülasyonun </w:t>
+      </w:r>
       <w:r>
         <w:rPr>
           <w:b/>
           <w:bCs/>
         </w:rPr>
-        <w:t xml:space="preserve">Kısaca:</w:t>
-      </w:r>
-      <w:r>
-        <w:t xml:space="preserve"> Route 345 gerçekçi ama az veri sunuyor. SDOF ise yapay ama bol veri sunuyor ve çevresel değişkenlik içeriyor. Raporda "sıcaklık yanlış alarmı artırıyor mu?" diye bir araştırma sorusu var. Bu soru ancak SDOF ile cevaplanabilir, çünkü Route 345'te sıcaklık neredeyse hiç değişmemiş.</w:t>
-      </w:r>
-    </w:p>
-    <w:p>
-      <w:pPr>
-        <w:pStyle w:val="Heading1"/>
-      </w:pPr>
-      <w:r>
-        <w:t xml:space="preserve">2. SDOF'un üç klasörü ne işe yarıyor?</w:t>
-      </w:r>
-    </w:p>
-    <w:p>
-      <w:pPr>
-        <w:spacing w:after="120" w:line="288"/>
-        <w:jc w:val="both"/>
-      </w:pPr>
-      <w:r>
-        <w:t xml:space="preserve">Bu üç klasör tek bir veri setinin parçaları. Yazarlar bir simülasyon yapmış ve hem simülasyonun </w:t>
+        <w:t xml:space="preserve">girdilerini</w:t>
+      </w:r>
+      <w:r>
+        <w:t xml:space="preserve">, </w:t>
       </w:r>
       <w:r>
         <w:rPr>
           <w:b/>
           <w:bCs/>
         </w:rPr>
-        <w:t xml:space="preserve">girdilerini</w:t>
-      </w:r>
-      <w:r>
-        <w:t xml:space="preserve">, hem </w:t>
+        <w:t xml:space="preserve">çıktılarını</w:t>
+      </w:r>
+      <w:r>
+        <w:t xml:space="preserve"> ve bunları üreten </w:t>
       </w:r>
       <w:r>
         <w:rPr>
           <w:b/>
           <w:bCs/>
         </w:rPr>
-        <w:t xml:space="preserve">çıktılarını</w:t>
-      </w:r>
-      <w:r>
-        <w:t xml:space="preserve">, hem de onları üreten </w:t>
-      </w:r>
-      <w:r>
-        <w:rPr>
-          <w:b/>
-          <w:bCs/>
-        </w:rPr>
         <w:t xml:space="preserve">kodu</w:t>
       </w:r>
       <w:r>
-        <w:t xml:space="preserve"> paylaşmış:</w:t>
+        <w:t xml:space="preserve"> birlikte paylaşmış [Z]:</w:t>
       </w:r>
     </w:p>
     <w:p>
@@ -1339,7 +1304,7 @@
           <w:sz w:val="17"/>
           <w:szCs w:val="17"/>
         </w:rPr>
-        <w:t xml:space="preserve">code/    → Veriyi ÜRETEN Jupyter notebook'lar (biz çalıştırmıyoruz, sadece referans)</w:t>
+        <w:t xml:space="preserve">code/    → Veriyi üreten Jupyter notebook'lar [N]</w:t>
       </w:r>
     </w:p>
     <w:p>
@@ -1355,7 +1320,7 @@
           <w:sz w:val="17"/>
           <w:szCs w:val="17"/>
         </w:rPr>
-        <w:t xml:space="preserve">           1_EOVs.ipynb   sıcaklık ve yük profillerini üretiyor</w:t>
+        <w:t xml:space="preserve">           1_EOVs.ipynb   sıcaklık ve yük dosyalarını üretiyor</w:t>
       </w:r>
     </w:p>
     <w:p>
@@ -1371,7 +1336,7 @@
           <w:sz w:val="17"/>
           <w:szCs w:val="17"/>
         </w:rPr>
-        <w:t xml:space="preserve">           2_SDOF.ipynb   yapı modelini kuruyor, hasar senaryolarını tanımlıyor</w:t>
+        <w:t xml:space="preserve">           2_SDOF.ipynb   km_pairs, labels ve deflection dosyalarını üretiyor</w:t>
       </w:r>
     </w:p>
     <w:p>
@@ -1403,7 +1368,7 @@
           <w:sz w:val="17"/>
           <w:szCs w:val="17"/>
         </w:rPr>
-        <w:t xml:space="preserve">           4_SFM.ipynb    sensör arızalarını (spike, drift, gain…) ekliyor</w:t>
+        <w:t xml:space="preserve">           4_SFM.ipynb    D4 için sensör arızalarını (spike, drift, gain, bias …) ekliyor</w:t>
       </w:r>
     </w:p>
     <w:p>
@@ -1435,7 +1400,7 @@
           <w:sz w:val="17"/>
           <w:szCs w:val="17"/>
         </w:rPr>
-        <w:t xml:space="preserve">input/   → Simülasyona VERİLEN şeyler = ortam koşulları</w:t>
+        <w:t xml:space="preserve">input/   → Simülasyonun girdileri</w:t>
       </w:r>
     </w:p>
     <w:p>
@@ -1451,7 +1416,7 @@
           <w:sz w:val="17"/>
           <w:szCs w:val="17"/>
         </w:rPr>
-        <w:t xml:space="preserve">           temperature/1_temperature.txt  saatlik sıcaklık</w:t>
+        <w:t xml:space="preserve">           temperature/termo_20xx.csv     ham sıcaklık verisi; 1_EOVs bunu saatliğe çeviriyor [N]</w:t>
       </w:r>
     </w:p>
     <w:p>
@@ -1467,7 +1432,7 @@
           <w:sz w:val="17"/>
           <w:szCs w:val="17"/>
         </w:rPr>
-        <w:t xml:space="preserve">           load/1_totLoad.txt             saatlik trafik yükü</w:t>
+        <w:t xml:space="preserve">           temperature/1_temperature.txt  saatlik sıcaklık [V]</w:t>
       </w:r>
     </w:p>
     <w:p>
@@ -1483,7 +1448,7 @@
           <w:sz w:val="17"/>
           <w:szCs w:val="17"/>
         </w:rPr>
-        <w:t xml:space="preserve">           km_pairs/*.txt                 her senaryo için saatlik rijitlik (k) ve kütle (m)</w:t>
+        <w:t xml:space="preserve">           load/1_totLoad.txt             saatlik toplam yük + LiveLoadLT + LiveLoadST [V]</w:t>
       </w:r>
     </w:p>
     <w:p>
@@ -1499,7 +1464,7 @@
           <w:sz w:val="17"/>
           <w:szCs w:val="17"/>
         </w:rPr>
-        <w:t xml:space="preserve"> </w:t>
+        <w:t xml:space="preserve">           km_pairs/*.txt                 senaryo başına saatlik rijitlik (sütun 0) ve kütle (sütun 1) [N]</w:t>
       </w:r>
     </w:p>
     <w:p>
@@ -1515,7 +1480,7 @@
           <w:sz w:val="17"/>
           <w:szCs w:val="17"/>
         </w:rPr>
-        <w:t xml:space="preserve">output/  → Simülasyonun ÜRETTİĞİ şeyler = "ölçüm" gibi davranan veri</w:t>
+        <w:t xml:space="preserve"> </w:t>
       </w:r>
     </w:p>
     <w:p>
@@ -1531,7 +1496,7 @@
           <w:sz w:val="17"/>
           <w:szCs w:val="17"/>
         </w:rPr>
-        <w:t xml:space="preserve">           acceleration/D1..D5/accNNNNN-k.h5   saatlik ivme sinyalleri (asıl veri)</w:t>
+        <w:t xml:space="preserve">output/  → Simülasyonun çıktıları</w:t>
       </w:r>
     </w:p>
     <w:p>
@@ -1547,7 +1512,23 @@
           <w:sz w:val="17"/>
           <w:szCs w:val="17"/>
         </w:rPr>
-        <w:t xml:space="preserve">           labels/*.txt                         her saatin etiketi (sağlıklı mı, hangi hasar)</w:t>
+        <w:t xml:space="preserve">           acceleration/D1..D5/accNNNNN-k.h5   saatlik ivme sinyalleri [V]</w:t>
+      </w:r>
+    </w:p>
+    <w:p>
+      <w:pPr>
+        <w:keepNext/>
+        <w:shd w:fill="F2F4F7" w:color="auto" w:val="clear"/>
+        <w:spacing w:after="0" w:line="240"/>
+        <w:ind w:left="140" w:right="140"/>
+      </w:pPr>
+      <w:r>
+        <w:rPr>
+          <w:rFonts w:ascii="Consolas" w:cs="Consolas" w:eastAsia="Consolas" w:hAnsi="Consolas"/>
+          <w:sz w:val="17"/>
+          <w:szCs w:val="17"/>
+        </w:rPr>
+        <w:t xml:space="preserve">           labels/*.txt                         her saatin etiketi: Label, Description, Level/Type [V]</w:t>
       </w:r>
     </w:p>
     <w:p>
@@ -1563,7 +1544,7 @@
           <w:sz w:val="17"/>
           <w:szCs w:val="17"/>
         </w:rPr>
-        <w:t xml:space="preserve">           deflection/                          orta nokta sehimi</w:t>
+        <w:t xml:space="preserve">           deflection/                          orta nokta sehimi [Z]</w:t>
       </w:r>
     </w:p>
     <w:p>
@@ -1572,7 +1553,7 @@
         <w:jc w:val="both"/>
       </w:pPr>
       <w:r>
-        <w:t xml:space="preserve">Mantık sırası şöyle: </w:t>
+        <w:t xml:space="preserve">Sıra: </w:t>
       </w:r>
       <w:r>
         <w:rPr>
@@ -1582,7 +1563,7 @@
         <w:t xml:space="preserve">input</w:t>
       </w:r>
       <w:r>
-        <w:t xml:space="preserve"> (koşullar) → </w:t>
+        <w:t xml:space="preserve"> → </w:t>
       </w:r>
       <w:r>
         <w:rPr>
@@ -1592,7 +1573,7 @@
         <w:t xml:space="preserve">code</w:t>
       </w:r>
       <w:r>
-        <w:t xml:space="preserve"> (simülasyon) → </w:t>
+        <w:t xml:space="preserve"> → </w:t>
       </w:r>
       <w:r>
         <w:rPr>
@@ -1602,7 +1583,15 @@
         <w:t xml:space="preserve">output</w:t>
       </w:r>
       <w:r>
-        <w:t xml:space="preserve"> (sinyal ve etiketler).</w:t>
+        <w:t xml:space="preserve">.</w:t>
+      </w:r>
+    </w:p>
+    <w:p>
+      <w:pPr>
+        <w:pStyle w:val="Heading1"/>
+      </w:pPr>
+      <w:r>
+        <w:t xml:space="preserve">3. veri_tasnif.py adım adım</w:t>
       </w:r>
     </w:p>
     <w:p>
@@ -1611,88 +1600,8 @@
         <w:jc w:val="both"/>
       </w:pPr>
       <w:r>
-        <w:t xml:space="preserve">Bizim için önemli olanlar şunlar:</w:t>
-      </w:r>
-    </w:p>
-    <w:p>
-      <w:pPr>
-        <w:pStyle w:val="ListParagraph"/>
-        <w:numPr>
-          <w:ilvl w:val="0"/>
-          <w:numId w:val="2"/>
-        </w:numPr>
-        <w:spacing w:after="60" w:line="276"/>
-      </w:pPr>
-      <w:r>
-        <w:rPr>
-          <w:b/>
-          <w:bCs/>
-        </w:rPr>
-        <w:t xml:space="preserve">output/acceleration</w:t>
-      </w:r>
-      <w:r>
-        <w:t xml:space="preserve">: modele vereceğimiz sinyal</w:t>
-      </w:r>
-    </w:p>
-    <w:p>
-      <w:pPr>
-        <w:pStyle w:val="ListParagraph"/>
-        <w:numPr>
-          <w:ilvl w:val="0"/>
-          <w:numId w:val="2"/>
-        </w:numPr>
-        <w:spacing w:after="60" w:line="276"/>
-      </w:pPr>
-      <w:r>
-        <w:rPr>
-          <w:b/>
-          <w:bCs/>
-        </w:rPr>
-        <w:t xml:space="preserve">output/labels</w:t>
-      </w:r>
-      <w:r>
-        <w:t xml:space="preserve">: doğruluk kontrolü için cevap anahtarı</w:t>
-      </w:r>
-    </w:p>
-    <w:p>
-      <w:pPr>
-        <w:pStyle w:val="ListParagraph"/>
-        <w:numPr>
-          <w:ilvl w:val="0"/>
-          <w:numId w:val="2"/>
-        </w:numPr>
-        <w:spacing w:after="60" w:line="276"/>
-      </w:pPr>
-      <w:r>
-        <w:rPr>
-          <w:b/>
-          <w:bCs/>
-        </w:rPr>
-        <w:t xml:space="preserve">input/temperature</w:t>
-      </w:r>
-      <w:r>
-        <w:t xml:space="preserve"> ve </w:t>
-      </w:r>
-      <w:r>
-        <w:rPr>
-          <w:b/>
-          <w:bCs/>
-        </w:rPr>
-        <w:t xml:space="preserve">input/load</w:t>
-      </w:r>
-      <w:r>
-        <w:t xml:space="preserve">: yanlış alarm analizi için yan bilgi</w:t>
-      </w:r>
-    </w:p>
-    <w:p>
-      <w:pPr>
-        <w:pBdr>
-          <w:left w:val="single" w:color="E69500" w:sz="18" w:space="6"/>
-        </w:pBdr>
-        <w:shd w:fill="FFF4E5" w:color="auto" w:val="clear"/>
-        <w:spacing w:after="160" w:before="80" w:line="276"/>
-        <w:ind w:left="140" w:right="140"/>
-      </w:pPr>
+        <w:t xml:space="preserve">Script iki veri setini okuyup bunlar için birer envanter tablosu ve birer örnek grafik üretiyor. Tüm çıktılar </w:t>
+      </w:r>
       <w:r>
         <w:rPr>
           <w:rFonts w:ascii="Consolas" w:cs="Consolas" w:eastAsia="Consolas" w:hAnsi="Consolas"/>
@@ -1700,39 +1609,10 @@
           <w:sz w:val="19"/>
           <w:szCs w:val="19"/>
         </w:rPr>
-        <w:t xml:space="preserve">km_pairs</w:t>
-      </w:r>
-      <w:r>
-        <w:t xml:space="preserve"> gerçek hayatta ölçülemeyecek "gerçek" rijitliği içeriyor. Bunu modele vermemeliyiz, yoksa kopya çekmiş oluruz. Sadece sonuçları yorumlarken kullanılabilir.</w:t>
-      </w:r>
-    </w:p>
-    <w:p>
-      <w:pPr>
-        <w:pStyle w:val="Heading1"/>
-      </w:pPr>
-      <w:r>
-        <w:t xml:space="preserve">3. veri_tasnif.py adım adım</w:t>
-      </w:r>
-    </w:p>
-    <w:p>
-      <w:pPr>
-        <w:spacing w:after="120" w:line="288"/>
-        <w:jc w:val="both"/>
-      </w:pPr>
-      <w:r>
-        <w:t xml:space="preserve">Script dört iş yapıyor: Route 345 için envanter ve grafik, SDOF için envanter ve grafik. Tüm çıktılar </w:t>
-      </w:r>
-      <w:r>
-        <w:rPr>
-          <w:rFonts w:ascii="Consolas" w:cs="Consolas" w:eastAsia="Consolas" w:hAnsi="Consolas"/>
-          <w:color w:val="7A2E0E"/>
-          <w:sz w:val="19"/>
-          <w:szCs w:val="19"/>
-        </w:rPr>
         <w:t xml:space="preserve">src/output/</w:t>
       </w:r>
       <w:r>
-        <w:t xml:space="preserve"> klasörüne yazılıyor.</w:t>
+        <w:t xml:space="preserve"> klasörüne yazılıyor. Veri dosyalarının hiçbiri değiştirilmiyor.</w:t>
       </w:r>
     </w:p>
     <w:p>
@@ -1944,7 +1824,7 @@
                 <w:sz w:val="19"/>
                 <w:szCs w:val="19"/>
               </w:rPr>
-              <w:t xml:space="preserve">h5 dosyasının klasör ağacını ve kök metadata'sını (köprü adı, koordinat sistemi, tarih) ekrana basıyor. Dosyayı tanımak için ilk adım.</w:t>
+              <w:t xml:space="preserve">h5 dosyasının klasör ağacını ve kök metadata'sını ekrana basıyor.</w:t>
             </w:r>
           </w:p>
         </w:tc>
@@ -2033,7 +1913,7 @@
                 <w:sz w:val="19"/>
                 <w:szCs w:val="19"/>
               </w:rPr>
-              <w:t xml:space="preserve">Tek bir sinyali okuyor. Örneğin baseline_1/acceleration/test_1/A21/z yolundan zaman ekseni, ivme dizisi ve fs döndürüyor.</w:t>
+              <w:t xml:space="preserve">Tek bir sinyali okuyor; zaman ekseni, ivme dizisi ve örnekleme frekansı döndürüyor.</w:t>
             </w:r>
           </w:p>
         </w:tc>
@@ -2062,7 +1942,7 @@
                 <w:sz w:val="19"/>
                 <w:szCs w:val="19"/>
               </w:rPr>
-              <w:t xml:space="preserve">Python değişkeni (ilerideki adımlar için)</w:t>
+              <w:t xml:space="preserve">Python değişkeni</w:t>
             </w:r>
           </w:p>
         </w:tc>
@@ -2211,7 +2091,7 @@
                 <w:sz w:val="19"/>
                 <w:szCs w:val="19"/>
               </w:rPr>
-              <w:t xml:space="preserve">8 senaryo × 3–4 test × 30 sensör × 2 yön üzerinden dönüyor. Her sinyal için metadata'yı ve basit istatistikleri (RMS, std, max) çıkarıp kalite bayraklarını koyuyor.</w:t>
+              <w:t xml:space="preserve">8 senaryo × 3–4 test × 30 sensör × 2 yön üzerinden dönüyor. Her sinyal için h5 metadata'sını yazıyor ve basit istatistikleri hesaplıyor.</w:t>
             </w:r>
           </w:p>
         </w:tc>
@@ -2309,7 +2189,7 @@
                 <w:sz w:val="19"/>
                 <w:szCs w:val="19"/>
               </w:rPr>
-              <w:t xml:space="preserve">Envanteri kayıt bazında özetliyor: kaç sensör var, hangileri bozuk, önerilen rol ne.</w:t>
+              <w:t xml:space="preserve">Envanteri kayıt (senaryo/test) bazında özetliyor.</w:t>
             </w:r>
           </w:p>
         </w:tc>
@@ -2407,7 +2287,7 @@
                 <w:sz w:val="19"/>
                 <w:szCs w:val="19"/>
               </w:rPr>
-              <w:t xml:space="preserve">A21 düşey ivmesini sağlıklı ve hasarlı durum için üst üste çiziyor, PSD'yi gösteriyor.</w:t>
+              <w:t xml:space="preserve">A21 sensörünün düşey ivmesi: baseline_1/test_1 zaman serisi ve 8 senaryonun test_1 PSD'leri.</w:t>
             </w:r>
           </w:p>
         </w:tc>
@@ -2455,7 +2335,490 @@
         <w:jc w:val="both"/>
       </w:pPr>
       <w:r>
-        <w:t xml:space="preserve">Kalite bayrakları şunlar:</w:t>
+        <w:rPr>
+          <w:rFonts w:ascii="Consolas" w:cs="Consolas" w:eastAsia="Consolas" w:hAnsi="Consolas"/>
+          <w:color w:val="7A2E0E"/>
+          <w:sz w:val="19"/>
+          <w:szCs w:val="19"/>
+        </w:rPr>
+        <w:t xml:space="preserve">rt345_kanal_envanteri.csv</w:t>
+      </w:r>
+      <w:r>
+        <w:t xml:space="preserve"> sütunlarının kaynağı:</w:t>
+      </w:r>
+    </w:p>
+    <w:tbl>
+      <w:tblPr>
+        <w:tblW w:type="dxa" w:w="9638"/>
+        <w:tblBorders>
+          <w:top w:val="single" w:color="auto" w:sz="4"/>
+          <w:left w:val="single" w:color="auto" w:sz="4"/>
+          <w:bottom w:val="single" w:color="auto" w:sz="4"/>
+          <w:right w:val="single" w:color="auto" w:sz="4"/>
+          <w:insideH w:val="single" w:color="auto" w:sz="4"/>
+          <w:insideV w:val="single" w:color="auto" w:sz="4"/>
+        </w:tblBorders>
+      </w:tblPr>
+      <w:tblGrid>
+        <w:gridCol w:w="5000"/>
+        <w:gridCol w:w="4638"/>
+      </w:tblGrid>
+      <w:tr>
+        <w:trPr>
+          <w:tblHeader/>
+        </w:trPr>
+        <w:tc>
+          <w:tcPr>
+            <w:tcW w:type="dxa" w:w="5000"/>
+            <w:tcBorders>
+              <w:top w:val="single" w:color="BFC7D1" w:sz="4"/>
+              <w:left w:val="single" w:color="BFC7D1" w:sz="4"/>
+              <w:bottom w:val="single" w:color="BFC7D1" w:sz="4"/>
+              <w:right w:val="single" w:color="BFC7D1" w:sz="4"/>
+            </w:tcBorders>
+            <w:shd w:fill="1F4E79" w:color="auto" w:val="clear"/>
+            <w:tcMar>
+              <w:top w:type="dxa" w:w="60"/>
+              <w:left w:type="dxa" w:w="100"/>
+              <w:bottom w:type="dxa" w:w="60"/>
+              <w:right w:type="dxa" w:w="100"/>
+            </w:tcMar>
+          </w:tcPr>
+          <w:p>
+            <w:pPr>
+              <w:spacing w:after="0" w:line="252"/>
+            </w:pPr>
+            <w:r>
+              <w:rPr>
+                <w:b/>
+                <w:bCs/>
+                <w:color w:val="FFFFFF"/>
+                <w:sz w:val="19"/>
+                <w:szCs w:val="19"/>
+              </w:rPr>
+              <w:t xml:space="preserve">Sütun</w:t>
+            </w:r>
+          </w:p>
+        </w:tc>
+        <w:tc>
+          <w:tcPr>
+            <w:tcW w:type="dxa" w:w="4638"/>
+            <w:tcBorders>
+              <w:top w:val="single" w:color="BFC7D1" w:sz="4"/>
+              <w:left w:val="single" w:color="BFC7D1" w:sz="4"/>
+              <w:bottom w:val="single" w:color="BFC7D1" w:sz="4"/>
+              <w:right w:val="single" w:color="BFC7D1" w:sz="4"/>
+            </w:tcBorders>
+            <w:shd w:fill="1F4E79" w:color="auto" w:val="clear"/>
+            <w:tcMar>
+              <w:top w:type="dxa" w:w="60"/>
+              <w:left w:type="dxa" w:w="100"/>
+              <w:bottom w:type="dxa" w:w="60"/>
+              <w:right w:type="dxa" w:w="100"/>
+            </w:tcMar>
+          </w:tcPr>
+          <w:p>
+            <w:pPr>
+              <w:spacing w:after="0" w:line="252"/>
+            </w:pPr>
+            <w:r>
+              <w:rPr>
+                <w:b/>
+                <w:bCs/>
+                <w:color w:val="FFFFFF"/>
+                <w:sz w:val="19"/>
+                <w:szCs w:val="19"/>
+              </w:rPr>
+              <w:t xml:space="preserve">Kaynak</w:t>
+            </w:r>
+          </w:p>
+        </w:tc>
+      </w:tr>
+      <w:tr>
+        <w:tc>
+          <w:tcPr>
+            <w:tcW w:type="dxa" w:w="5000"/>
+            <w:tcBorders>
+              <w:top w:val="single" w:color="BFC7D1" w:sz="4"/>
+              <w:left w:val="single" w:color="BFC7D1" w:sz="4"/>
+              <w:bottom w:val="single" w:color="BFC7D1" w:sz="4"/>
+              <w:right w:val="single" w:color="BFC7D1" w:sz="4"/>
+            </w:tcBorders>
+            <w:tcMar>
+              <w:top w:type="dxa" w:w="60"/>
+              <w:left w:type="dxa" w:w="100"/>
+              <w:bottom w:type="dxa" w:w="60"/>
+              <w:right w:type="dxa" w:w="100"/>
+            </w:tcMar>
+          </w:tcPr>
+          <w:p>
+            <w:pPr>
+              <w:spacing w:after="0" w:line="252"/>
+            </w:pPr>
+            <w:r>
+              <w:rPr>
+                <w:sz w:val="19"/>
+                <w:szCs w:val="19"/>
+              </w:rPr>
+              <w:t xml:space="preserve">damage_state, damage_type, damage_location, damage_severity, zaman, location, x_m/y_m/z_m, sample_rate_hz, unit</w:t>
+            </w:r>
+          </w:p>
+        </w:tc>
+        <w:tc>
+          <w:tcPr>
+            <w:tcW w:type="dxa" w:w="4638"/>
+            <w:tcBorders>
+              <w:top w:val="single" w:color="BFC7D1" w:sz="4"/>
+              <w:left w:val="single" w:color="BFC7D1" w:sz="4"/>
+              <w:bottom w:val="single" w:color="BFC7D1" w:sz="4"/>
+              <w:right w:val="single" w:color="BFC7D1" w:sz="4"/>
+            </w:tcBorders>
+            <w:tcMar>
+              <w:top w:type="dxa" w:w="60"/>
+              <w:left w:type="dxa" w:w="100"/>
+              <w:bottom w:type="dxa" w:w="60"/>
+              <w:right w:type="dxa" w:w="100"/>
+            </w:tcMar>
+          </w:tcPr>
+          <w:p>
+            <w:pPr>
+              <w:spacing w:after="0" w:line="252"/>
+            </w:pPr>
+            <w:r>
+              <w:rPr>
+                <w:sz w:val="19"/>
+                <w:szCs w:val="19"/>
+              </w:rPr>
+              <w:t xml:space="preserve">h5 attribute'ları [V]</w:t>
+            </w:r>
+          </w:p>
+        </w:tc>
+      </w:tr>
+      <w:tr>
+        <w:tc>
+          <w:tcPr>
+            <w:tcW w:type="dxa" w:w="5000"/>
+            <w:tcBorders>
+              <w:top w:val="single" w:color="BFC7D1" w:sz="4"/>
+              <w:left w:val="single" w:color="BFC7D1" w:sz="4"/>
+              <w:bottom w:val="single" w:color="BFC7D1" w:sz="4"/>
+              <w:right w:val="single" w:color="BFC7D1" w:sz="4"/>
+            </w:tcBorders>
+            <w:tcMar>
+              <w:top w:type="dxa" w:w="60"/>
+              <w:left w:type="dxa" w:w="100"/>
+              <w:bottom w:type="dxa" w:w="60"/>
+              <w:right w:type="dxa" w:w="100"/>
+            </w:tcMar>
+          </w:tcPr>
+          <w:p>
+            <w:pPr>
+              <w:spacing w:after="0" w:line="252"/>
+            </w:pPr>
+            <w:r>
+              <w:rPr>
+                <w:sz w:val="19"/>
+                <w:szCs w:val="19"/>
+              </w:rPr>
+              <w:t xml:space="preserve">case_no, makale_senaryo_adi</w:t>
+            </w:r>
+          </w:p>
+        </w:tc>
+        <w:tc>
+          <w:tcPr>
+            <w:tcW w:type="dxa" w:w="4638"/>
+            <w:tcBorders>
+              <w:top w:val="single" w:color="BFC7D1" w:sz="4"/>
+              <w:left w:val="single" w:color="BFC7D1" w:sz="4"/>
+              <w:bottom w:val="single" w:color="BFC7D1" w:sz="4"/>
+              <w:right w:val="single" w:color="BFC7D1" w:sz="4"/>
+            </w:tcBorders>
+            <w:tcMar>
+              <w:top w:type="dxa" w:w="60"/>
+              <w:left w:type="dxa" w:w="100"/>
+              <w:bottom w:type="dxa" w:w="60"/>
+              <w:right w:type="dxa" w:w="100"/>
+            </w:tcMar>
+          </w:tcPr>
+          <w:p>
+            <w:pPr>
+              <w:spacing w:after="0" w:line="252"/>
+            </w:pPr>
+            <w:r>
+              <w:rPr>
+                <w:sz w:val="19"/>
+                <w:szCs w:val="19"/>
+              </w:rPr>
+              <w:t xml:space="preserve">Makale Tablo 2 [M]</w:t>
+            </w:r>
+          </w:p>
+        </w:tc>
+      </w:tr>
+      <w:tr>
+        <w:tc>
+          <w:tcPr>
+            <w:tcW w:type="dxa" w:w="5000"/>
+            <w:tcBorders>
+              <w:top w:val="single" w:color="BFC7D1" w:sz="4"/>
+              <w:left w:val="single" w:color="BFC7D1" w:sz="4"/>
+              <w:bottom w:val="single" w:color="BFC7D1" w:sz="4"/>
+              <w:right w:val="single" w:color="BFC7D1" w:sz="4"/>
+            </w:tcBorders>
+            <w:tcMar>
+              <w:top w:type="dxa" w:w="60"/>
+              <w:left w:type="dxa" w:w="100"/>
+              <w:bottom w:type="dxa" w:w="60"/>
+              <w:right w:type="dxa" w:w="100"/>
+            </w:tcMar>
+          </w:tcPr>
+          <w:p>
+            <w:pPr>
+              <w:spacing w:after="0" w:line="252"/>
+            </w:pPr>
+            <w:r>
+              <w:rPr>
+                <w:sz w:val="19"/>
+                <w:szCs w:val="19"/>
+              </w:rPr>
+              <w:t xml:space="preserve">n_ornek, sure_s, nan_sayisi, std, rms, max_abs</w:t>
+            </w:r>
+          </w:p>
+        </w:tc>
+        <w:tc>
+          <w:tcPr>
+            <w:tcW w:type="dxa" w:w="4638"/>
+            <w:tcBorders>
+              <w:top w:val="single" w:color="BFC7D1" w:sz="4"/>
+              <w:left w:val="single" w:color="BFC7D1" w:sz="4"/>
+              <w:bottom w:val="single" w:color="BFC7D1" w:sz="4"/>
+              <w:right w:val="single" w:color="BFC7D1" w:sz="4"/>
+            </w:tcBorders>
+            <w:tcMar>
+              <w:top w:type="dxa" w:w="60"/>
+              <w:left w:type="dxa" w:w="100"/>
+              <w:bottom w:type="dxa" w:w="60"/>
+              <w:right w:type="dxa" w:w="100"/>
+            </w:tcMar>
+          </w:tcPr>
+          <w:p>
+            <w:pPr>
+              <w:spacing w:after="0" w:line="252"/>
+            </w:pPr>
+            <w:r>
+              <w:rPr>
+                <w:sz w:val="19"/>
+                <w:szCs w:val="19"/>
+              </w:rPr>
+              <w:t xml:space="preserve">Sinyalden hesaplandı [V]</w:t>
+            </w:r>
+          </w:p>
+        </w:tc>
+      </w:tr>
+      <w:tr>
+        <w:tc>
+          <w:tcPr>
+            <w:tcW w:type="dxa" w:w="5000"/>
+            <w:tcBorders>
+              <w:top w:val="single" w:color="BFC7D1" w:sz="4"/>
+              <w:left w:val="single" w:color="BFC7D1" w:sz="4"/>
+              <w:bottom w:val="single" w:color="BFC7D1" w:sz="4"/>
+              <w:right w:val="single" w:color="BFC7D1" w:sz="4"/>
+            </w:tcBorders>
+            <w:tcMar>
+              <w:top w:type="dxa" w:w="60"/>
+              <w:left w:type="dxa" w:w="100"/>
+              <w:bottom w:type="dxa" w:w="60"/>
+              <w:right w:type="dxa" w:w="100"/>
+            </w:tcMar>
+          </w:tcPr>
+          <w:p>
+            <w:pPr>
+              <w:spacing w:after="0" w:line="252"/>
+            </w:pPr>
+            <w:r>
+              <w:rPr>
+                <w:sz w:val="19"/>
+                <w:szCs w:val="19"/>
+              </w:rPr>
+              <w:t xml:space="preserve">tum_degerler_sifir</w:t>
+            </w:r>
+          </w:p>
+        </w:tc>
+        <w:tc>
+          <w:tcPr>
+            <w:tcW w:type="dxa" w:w="4638"/>
+            <w:tcBorders>
+              <w:top w:val="single" w:color="BFC7D1" w:sz="4"/>
+              <w:left w:val="single" w:color="BFC7D1" w:sz="4"/>
+              <w:bottom w:val="single" w:color="BFC7D1" w:sz="4"/>
+              <w:right w:val="single" w:color="BFC7D1" w:sz="4"/>
+            </w:tcBorders>
+            <w:tcMar>
+              <w:top w:type="dxa" w:w="60"/>
+              <w:left w:type="dxa" w:w="100"/>
+              <w:bottom w:type="dxa" w:w="60"/>
+              <w:right w:type="dxa" w:w="100"/>
+            </w:tcMar>
+          </w:tcPr>
+          <w:p>
+            <w:pPr>
+              <w:spacing w:after="0" w:line="252"/>
+            </w:pPr>
+            <w:r>
+              <w:rPr>
+                <w:sz w:val="19"/>
+                <w:szCs w:val="19"/>
+              </w:rPr>
+              <w:t xml:space="preserve">Sinyalin bütün örnekleri 0 mı? [V]</w:t>
+            </w:r>
+          </w:p>
+        </w:tc>
+      </w:tr>
+      <w:tr>
+        <w:tc>
+          <w:tcPr>
+            <w:tcW w:type="dxa" w:w="5000"/>
+            <w:tcBorders>
+              <w:top w:val="single" w:color="BFC7D1" w:sz="4"/>
+              <w:left w:val="single" w:color="BFC7D1" w:sz="4"/>
+              <w:bottom w:val="single" w:color="BFC7D1" w:sz="4"/>
+              <w:right w:val="single" w:color="BFC7D1" w:sz="4"/>
+            </w:tcBorders>
+            <w:tcMar>
+              <w:top w:type="dxa" w:w="60"/>
+              <w:left w:type="dxa" w:w="100"/>
+              <w:bottom w:type="dxa" w:w="60"/>
+              <w:right w:type="dxa" w:w="100"/>
+            </w:tcMar>
+          </w:tcPr>
+          <w:p>
+            <w:pPr>
+              <w:spacing w:after="0" w:line="252"/>
+            </w:pPr>
+            <w:r>
+              <w:rPr>
+                <w:sz w:val="19"/>
+                <w:szCs w:val="19"/>
+              </w:rPr>
+              <w:t xml:space="preserve">olcum_araligi_asildi</w:t>
+            </w:r>
+          </w:p>
+        </w:tc>
+        <w:tc>
+          <w:tcPr>
+            <w:tcW w:type="dxa" w:w="4638"/>
+            <w:tcBorders>
+              <w:top w:val="single" w:color="BFC7D1" w:sz="4"/>
+              <w:left w:val="single" w:color="BFC7D1" w:sz="4"/>
+              <w:bottom w:val="single" w:color="BFC7D1" w:sz="4"/>
+              <w:right w:val="single" w:color="BFC7D1" w:sz="4"/>
+            </w:tcBorders>
+            <w:tcMar>
+              <w:top w:type="dxa" w:w="60"/>
+              <w:left w:type="dxa" w:w="100"/>
+              <w:bottom w:type="dxa" w:w="60"/>
+              <w:right w:type="dxa" w:w="100"/>
+            </w:tcMar>
+          </w:tcPr>
+          <w:p>
+            <w:pPr>
+              <w:spacing w:after="0" w:line="252"/>
+            </w:pPr>
+            <w:r>
+              <w:rPr>
+                <w:sz w:val="19"/>
+                <w:szCs w:val="19"/>
+              </w:rPr>
+              <w:t xml:space="preserve">max_abs, sensörün ±2 g ölçüm aralığını aşıyor mu? [V] + [M]</w:t>
+            </w:r>
+          </w:p>
+        </w:tc>
+      </w:tr>
+      <w:tr>
+        <w:tc>
+          <w:tcPr>
+            <w:tcW w:type="dxa" w:w="5000"/>
+            <w:tcBorders>
+              <w:top w:val="single" w:color="BFC7D1" w:sz="4"/>
+              <w:left w:val="single" w:color="BFC7D1" w:sz="4"/>
+              <w:bottom w:val="single" w:color="BFC7D1" w:sz="4"/>
+              <w:right w:val="single" w:color="BFC7D1" w:sz="4"/>
+            </w:tcBorders>
+            <w:tcMar>
+              <w:top w:type="dxa" w:w="60"/>
+              <w:left w:type="dxa" w:w="100"/>
+              <w:bottom w:type="dxa" w:w="60"/>
+              <w:right w:type="dxa" w:w="100"/>
+            </w:tcMar>
+          </w:tcPr>
+          <w:p>
+            <w:pPr>
+              <w:spacing w:after="0" w:line="252"/>
+            </w:pPr>
+            <w:r>
+              <w:rPr>
+                <w:sz w:val="19"/>
+                <w:szCs w:val="19"/>
+              </w:rPr>
+              <w:t xml:space="preserve">makale_notu</w:t>
+            </w:r>
+          </w:p>
+        </w:tc>
+        <w:tc>
+          <w:tcPr>
+            <w:tcW w:type="dxa" w:w="4638"/>
+            <w:tcBorders>
+              <w:top w:val="single" w:color="BFC7D1" w:sz="4"/>
+              <w:left w:val="single" w:color="BFC7D1" w:sz="4"/>
+              <w:bottom w:val="single" w:color="BFC7D1" w:sz="4"/>
+              <w:right w:val="single" w:color="BFC7D1" w:sz="4"/>
+            </w:tcBorders>
+            <w:tcMar>
+              <w:top w:type="dxa" w:w="60"/>
+              <w:left w:type="dxa" w:w="100"/>
+              <w:bottom w:type="dxa" w:w="60"/>
+              <w:right w:type="dxa" w:w="100"/>
+            </w:tcMar>
+          </w:tcPr>
+          <w:p>
+            <w:pPr>
+              <w:spacing w:after="0" w:line="252"/>
+            </w:pPr>
+            <w:r>
+              <w:rPr>
+                <w:sz w:val="19"/>
+                <w:szCs w:val="19"/>
+              </w:rPr>
+              <w:t xml:space="preserve">Makalenin bu kanal için belirttiği bir durum varsa [M]</w:t>
+            </w:r>
+          </w:p>
+        </w:tc>
+      </w:tr>
+    </w:tbl>
+    <w:p>
+      <w:pPr>
+        <w:spacing w:after="120"/>
+      </w:pPr>
+    </w:p>
+    <w:p>
+      <w:pPr>
+        <w:pStyle w:val="Heading2"/>
+      </w:pPr>
+      <w:r>
+        <w:t xml:space="preserve">3.2 Bölüm 2: SDOF</w:t>
+      </w:r>
+    </w:p>
+    <w:p>
+      <w:pPr>
+        <w:spacing w:after="120" w:line="288"/>
+        <w:jc w:val="both"/>
+      </w:pPr>
+      <w:r>
+        <w:rPr>
+          <w:b/>
+          <w:bCs/>
+        </w:rPr>
+        <w:t xml:space="preserve">Girdiler:</w:t>
       </w:r>
     </w:p>
     <w:p>
@@ -2474,10 +2837,20 @@
           <w:sz w:val="19"/>
           <w:szCs w:val="19"/>
         </w:rPr>
-        <w:t xml:space="preserve">kalite_sabit_sinyal</w:t>
-      </w:r>
-      <w:r>
-        <w:t xml:space="preserve">: sinyal hep aynı değerde mi? Ölü sensör kontrolü. A14 damage_6'da bunu yakaladı.</w:t>
+        <w:t xml:space="preserve">output/output/acceleration/D1..D5/*.h5</w:t>
+      </w:r>
+      <w:r>
+        <w:t xml:space="preserve">: envanter için sadece </w:t>
+      </w:r>
+      <w:r>
+        <w:rPr>
+          <w:b/>
+          <w:bCs/>
+        </w:rPr>
+        <w:t xml:space="preserve">dosya adları</w:t>
+      </w:r>
+      <w:r>
+        <w:t xml:space="preserve"> okunuyor</w:t>
       </w:r>
     </w:p>
     <w:p>
@@ -2496,10 +2869,10 @@
           <w:sz w:val="19"/>
           <w:szCs w:val="19"/>
         </w:rPr>
-        <w:t xml:space="preserve">kalite_doygunluk</w:t>
-      </w:r>
-      <w:r>
-        <w:t xml:space="preserve">: değer sensör sınırına (±2 g) ulaşmış mı?</w:t>
+        <w:t xml:space="preserve">output/output/labels/*.txt</w:t>
+      </w:r>
+      <w:r>
+        <w:t xml:space="preserve">: etiketler</w:t>
       </w:r>
     </w:p>
     <w:p>
@@ -2518,184 +2891,10 @@
           <w:sz w:val="19"/>
           <w:szCs w:val="19"/>
         </w:rPr>
-        <w:t xml:space="preserve">kalite_std_aykiri</w:t>
-      </w:r>
-      <w:r>
-        <w:t xml:space="preserve">: aynı sensörün diğer kayıtlarına göre std 5 kattan fazla mı farklı?</w:t>
-      </w:r>
-    </w:p>
-    <w:p>
-      <w:pPr>
-        <w:pStyle w:val="ListParagraph"/>
-        <w:numPr>
-          <w:ilvl w:val="0"/>
-          <w:numId w:val="2"/>
-        </w:numPr>
-        <w:spacing w:after="60" w:line="276"/>
-      </w:pPr>
-      <w:r>
-        <w:rPr>
-          <w:rFonts w:ascii="Consolas" w:cs="Consolas" w:eastAsia="Consolas" w:hAnsi="Consolas"/>
-          <w:color w:val="7A2E0E"/>
-          <w:sz w:val="19"/>
-          <w:szCs w:val="19"/>
-        </w:rPr>
-        <w:t xml:space="preserve">nan_sayisi</w:t>
-      </w:r>
-      <w:r>
-        <w:t xml:space="preserve">: eksik veri var mı?</w:t>
-      </w:r>
-    </w:p>
-    <w:p>
-      <w:pPr>
-        <w:pStyle w:val="ListParagraph"/>
-        <w:numPr>
-          <w:ilvl w:val="0"/>
-          <w:numId w:val="2"/>
-        </w:numPr>
-        <w:spacing w:after="60" w:line="276"/>
-      </w:pPr>
-      <w:r>
-        <w:rPr>
-          <w:rFonts w:ascii="Consolas" w:cs="Consolas" w:eastAsia="Consolas" w:hAnsi="Consolas"/>
-          <w:color w:val="7A2E0E"/>
-          <w:sz w:val="19"/>
-          <w:szCs w:val="19"/>
-        </w:rPr>
-        <w:t xml:space="preserve">kalite_ok</w:t>
-      </w:r>
-      <w:r>
-        <w:t xml:space="preserve">: yukarıdakilerin hiçbiri yoksa True.</w:t>
-      </w:r>
-    </w:p>
-    <w:p>
-      <w:pPr>
-        <w:spacing w:after="120" w:line="288"/>
-        <w:jc w:val="both"/>
-      </w:pPr>
-      <w:r>
-        <w:t xml:space="preserve">Sağlıklı/hasarlı etiketi ve case numarası script'in başındaki </w:t>
-      </w:r>
-      <w:r>
-        <w:rPr>
-          <w:rFonts w:ascii="Consolas" w:cs="Consolas" w:eastAsia="Consolas" w:hAnsi="Consolas"/>
-          <w:color w:val="7A2E0E"/>
-          <w:sz w:val="19"/>
-          <w:szCs w:val="19"/>
-        </w:rPr>
-        <w:t xml:space="preserve">RT345_SENARYO</w:t>
-      </w:r>
-      <w:r>
-        <w:t xml:space="preserve"> sözlüğünden geliyor. Bunu makaledeki Table 2'ye bakarak elle yazdım. h5'in içinde hazır bir "label" alanı yok; sadece </w:t>
-      </w:r>
-      <w:r>
-        <w:rPr>
-          <w:rFonts w:ascii="Consolas" w:cs="Consolas" w:eastAsia="Consolas" w:hAnsi="Consolas"/>
-          <w:color w:val="7A2E0E"/>
-          <w:sz w:val="19"/>
-          <w:szCs w:val="19"/>
-        </w:rPr>
-        <w:t xml:space="preserve">damage_type</w:t>
-      </w:r>
-      <w:r>
-        <w:t xml:space="preserve"> gibi açıklama metinleri var.</w:t>
-      </w:r>
-    </w:p>
-    <w:p>
-      <w:pPr>
-        <w:pStyle w:val="Heading2"/>
-      </w:pPr>
-      <w:r>
-        <w:t xml:space="preserve">3.2 Bölüm 2: SDOF</w:t>
-      </w:r>
-    </w:p>
-    <w:p>
-      <w:pPr>
-        <w:spacing w:after="120" w:line="288"/>
-        <w:jc w:val="both"/>
-      </w:pPr>
-      <w:r>
-        <w:rPr>
-          <w:b/>
-          <w:bCs/>
-        </w:rPr>
-        <w:t xml:space="preserve">Girdiler:</w:t>
-      </w:r>
-    </w:p>
-    <w:p>
-      <w:pPr>
-        <w:pStyle w:val="ListParagraph"/>
-        <w:numPr>
-          <w:ilvl w:val="0"/>
-          <w:numId w:val="2"/>
-        </w:numPr>
-        <w:spacing w:after="60" w:line="276"/>
-      </w:pPr>
-      <w:r>
-        <w:rPr>
-          <w:rFonts w:ascii="Consolas" w:cs="Consolas" w:eastAsia="Consolas" w:hAnsi="Consolas"/>
-          <w:color w:val="7A2E0E"/>
-          <w:sz w:val="19"/>
-          <w:szCs w:val="19"/>
-        </w:rPr>
-        <w:t xml:space="preserve">output/output/acceleration/D1..D5/*.h5</w:t>
-      </w:r>
-      <w:r>
-        <w:t xml:space="preserve">: sadece </w:t>
-      </w:r>
-      <w:r>
-        <w:rPr>
-          <w:b/>
-          <w:bCs/>
-        </w:rPr>
-        <w:t xml:space="preserve">dosya adları</w:t>
-      </w:r>
-      <w:r>
-        <w:t xml:space="preserve"> okunuyor, içerik değil (hız için)</w:t>
-      </w:r>
-    </w:p>
-    <w:p>
-      <w:pPr>
-        <w:pStyle w:val="ListParagraph"/>
-        <w:numPr>
-          <w:ilvl w:val="0"/>
-          <w:numId w:val="2"/>
-        </w:numPr>
-        <w:spacing w:after="60" w:line="276"/>
-      </w:pPr>
-      <w:r>
-        <w:rPr>
-          <w:rFonts w:ascii="Consolas" w:cs="Consolas" w:eastAsia="Consolas" w:hAnsi="Consolas"/>
-          <w:color w:val="7A2E0E"/>
-          <w:sz w:val="19"/>
-          <w:szCs w:val="19"/>
-        </w:rPr>
-        <w:t xml:space="preserve">output/output/labels/*.txt</w:t>
-      </w:r>
-      <w:r>
-        <w:t xml:space="preserve">: etiketler</w:t>
-      </w:r>
-    </w:p>
-    <w:p>
-      <w:pPr>
-        <w:pStyle w:val="ListParagraph"/>
-        <w:numPr>
-          <w:ilvl w:val="0"/>
-          <w:numId w:val="2"/>
-        </w:numPr>
-        <w:spacing w:after="60" w:line="276"/>
-      </w:pPr>
-      <w:r>
-        <w:rPr>
-          <w:rFonts w:ascii="Consolas" w:cs="Consolas" w:eastAsia="Consolas" w:hAnsi="Consolas"/>
-          <w:color w:val="7A2E0E"/>
-          <w:sz w:val="19"/>
-          <w:szCs w:val="19"/>
-        </w:rPr>
         <w:t xml:space="preserve">input/input/load/1_totLoad.txt</w:t>
       </w:r>
       <w:r>
-        <w:t xml:space="preserve">: tarih ve trafik yükü</w:t>
+        <w:t xml:space="preserve">: trafik yükü</w:t>
       </w:r>
     </w:p>
     <w:p>
@@ -2867,7 +3066,7 @@
                 <w:sz w:val="19"/>
                 <w:szCs w:val="19"/>
               </w:rPr>
-              <w:t xml:space="preserve">sdof_ivme_oku(senaryo, saat)</w:t>
+              <w:t xml:space="preserve">sdof_zaman_izgarasi()</w:t>
             </w:r>
           </w:p>
         </w:tc>
@@ -2896,7 +3095,7 @@
                 <w:sz w:val="19"/>
                 <w:szCs w:val="19"/>
               </w:rPr>
-              <w:t xml:space="preserve">Örneğin D2_3/acc20000-23.h5 içindeki acc datasetini okuyor (18 000 örnek).</w:t>
+              <w:t xml:space="preserve">Saat indeksini tarihe çeviren tabloyu kuruyor (aşağıda).</w:t>
             </w:r>
           </w:p>
         </w:tc>
@@ -2956,6 +3155,95 @@
                 <w:sz w:val="19"/>
                 <w:szCs w:val="19"/>
               </w:rPr>
+              <w:t xml:space="preserve">sdof_ivme_oku(senaryo, saat)</w:t>
+            </w:r>
+          </w:p>
+        </w:tc>
+        <w:tc>
+          <w:tcPr>
+            <w:tcW w:type="dxa" w:w="4638"/>
+            <w:tcBorders>
+              <w:top w:val="single" w:color="BFC7D1" w:sz="4"/>
+              <w:left w:val="single" w:color="BFC7D1" w:sz="4"/>
+              <w:bottom w:val="single" w:color="BFC7D1" w:sz="4"/>
+              <w:right w:val="single" w:color="BFC7D1" w:sz="4"/>
+            </w:tcBorders>
+            <w:tcMar>
+              <w:top w:type="dxa" w:w="60"/>
+              <w:left w:type="dxa" w:w="100"/>
+              <w:bottom w:type="dxa" w:w="60"/>
+              <w:right w:type="dxa" w:w="100"/>
+            </w:tcMar>
+          </w:tcPr>
+          <w:p>
+            <w:pPr>
+              <w:spacing w:after="0" w:line="252"/>
+            </w:pPr>
+            <w:r>
+              <w:rPr>
+                <w:sz w:val="19"/>
+                <w:szCs w:val="19"/>
+              </w:rPr>
+              <w:t xml:space="preserve">Bir ivme dosyasındaki acc datasetini okuyor (18 000 örnek).</w:t>
+            </w:r>
+          </w:p>
+        </w:tc>
+        <w:tc>
+          <w:tcPr>
+            <w:tcW w:type="dxa" w:w="2300"/>
+            <w:tcBorders>
+              <w:top w:val="single" w:color="BFC7D1" w:sz="4"/>
+              <w:left w:val="single" w:color="BFC7D1" w:sz="4"/>
+              <w:bottom w:val="single" w:color="BFC7D1" w:sz="4"/>
+              <w:right w:val="single" w:color="BFC7D1" w:sz="4"/>
+            </w:tcBorders>
+            <w:tcMar>
+              <w:top w:type="dxa" w:w="60"/>
+              <w:left w:type="dxa" w:w="100"/>
+              <w:bottom w:type="dxa" w:w="60"/>
+              <w:right w:type="dxa" w:w="100"/>
+            </w:tcMar>
+          </w:tcPr>
+          <w:p>
+            <w:pPr>
+              <w:spacing w:after="0" w:line="252"/>
+            </w:pPr>
+            <w:r>
+              <w:rPr>
+                <w:sz w:val="19"/>
+                <w:szCs w:val="19"/>
+              </w:rPr>
+              <w:t xml:space="preserve">Python değişkeni</w:t>
+            </w:r>
+          </w:p>
+        </w:tc>
+      </w:tr>
+      <w:tr>
+        <w:tc>
+          <w:tcPr>
+            <w:tcW w:type="dxa" w:w="2700"/>
+            <w:tcBorders>
+              <w:top w:val="single" w:color="BFC7D1" w:sz="4"/>
+              <w:left w:val="single" w:color="BFC7D1" w:sz="4"/>
+              <w:bottom w:val="single" w:color="BFC7D1" w:sz="4"/>
+              <w:right w:val="single" w:color="BFC7D1" w:sz="4"/>
+            </w:tcBorders>
+            <w:tcMar>
+              <w:top w:type="dxa" w:w="60"/>
+              <w:left w:type="dxa" w:w="100"/>
+              <w:bottom w:type="dxa" w:w="60"/>
+              <w:right w:type="dxa" w:w="100"/>
+            </w:tcMar>
+          </w:tcPr>
+          <w:p>
+            <w:pPr>
+              <w:spacing w:after="0" w:line="252"/>
+            </w:pPr>
+            <w:r>
+              <w:rPr>
+                <w:sz w:val="19"/>
+                <w:szCs w:val="19"/>
+              </w:rPr>
               <w:t xml:space="preserve">sdof_envanter()</w:t>
             </w:r>
           </w:p>
@@ -2985,7 +3273,7 @@
                 <w:sz w:val="19"/>
                 <w:szCs w:val="19"/>
               </w:rPr>
-              <w:t xml:space="preserve">Üç tabloyu birleştiriyor (aşağıda).</w:t>
+              <w:t xml:space="preserve">Dosya adı, etiket, tarih, sıcaklık ve yükü saat indeksi üzerinden birleştiriyor.</w:t>
             </w:r>
           </w:p>
         </w:tc>
@@ -3023,7 +3311,7 @@
                 <w:sz w:val="19"/>
                 <w:szCs w:val="19"/>
               </w:rPr>
-              <w:t xml:space="preserve"> (~125 bin satır)</w:t>
+              <w:t xml:space="preserve"> (125 134 satır)</w:t>
             </w:r>
           </w:p>
         </w:tc>
@@ -3083,7 +3371,7 @@
                 <w:sz w:val="19"/>
                 <w:szCs w:val="19"/>
               </w:rPr>
-              <w:t xml:space="preserve">Senaryo/sınıf bazında dosya sayısı ve tarih aralığı</w:t>
+              <w:t xml:space="preserve">Senaryo ve etiket bazında dosya sayısı ve tarih aralığı</w:t>
             </w:r>
           </w:p>
         </w:tc>
@@ -3174,7 +3462,7 @@
                 <w:sz w:val="19"/>
                 <w:szCs w:val="19"/>
               </w:rPr>
-              <w:t xml:space="preserve">Aynı saatte (aynı sıcaklıkta) sağlıklı D1 ile −8% hasarlı D2_3'ü karşılaştırıyor.</w:t>
+              <w:t xml:space="preserve">acc00000-1.h5 zaman serisi ve saat 26278'in tüm senaryolardaki PSD'si.</w:t>
             </w:r>
           </w:p>
         </w:tc>
@@ -3221,6 +3509,82 @@
         <w:spacing w:after="120" w:line="288"/>
         <w:jc w:val="both"/>
       </w:pPr>
+      <w:r>
+        <w:t xml:space="preserve">Birleştirme şöyle çalışıyor:</w:t>
+      </w:r>
+    </w:p>
+    <w:p>
+      <w:pPr>
+        <w:keepNext/>
+        <w:shd w:fill="F2F4F7" w:color="auto" w:val="clear"/>
+        <w:spacing w:after="0" w:line="240"/>
+        <w:ind w:left="140" w:right="140"/>
+      </w:pPr>
+      <w:r>
+        <w:rPr>
+          <w:rFonts w:ascii="Consolas" w:cs="Consolas" w:eastAsia="Consolas" w:hAnsi="Consolas"/>
+          <w:sz w:val="17"/>
+          <w:szCs w:val="17"/>
+        </w:rPr>
+        <w:t xml:space="preserve">dosya adı  acc20000-23.h5    →  saat indeksi = 20000</w:t>
+      </w:r>
+    </w:p>
+    <w:p>
+      <w:pPr>
+        <w:keepNext/>
+        <w:shd w:fill="F2F4F7" w:color="auto" w:val="clear"/>
+        <w:spacing w:after="0" w:line="240"/>
+        <w:ind w:left="140" w:right="140"/>
+      </w:pPr>
+      <w:r>
+        <w:rPr>
+          <w:rFonts w:ascii="Consolas" w:cs="Consolas" w:eastAsia="Consolas" w:hAnsi="Consolas"/>
+          <w:sz w:val="17"/>
+          <w:szCs w:val="17"/>
+        </w:rPr>
+        <w:t xml:space="preserve">labels/4_D2.3_labels.txt     Index = 20000   →  Label, Description, Level/Type</w:t>
+      </w:r>
+    </w:p>
+    <w:p>
+      <w:pPr>
+        <w:keepNext/>
+        <w:shd w:fill="F2F4F7" w:color="auto" w:val="clear"/>
+        <w:spacing w:after="0" w:line="240"/>
+        <w:ind w:left="140" w:right="140"/>
+      </w:pPr>
+      <w:r>
+        <w:rPr>
+          <w:rFonts w:ascii="Consolas" w:cs="Consolas" w:eastAsia="Consolas" w:hAnsi="Consolas"/>
+          <w:sz w:val="17"/>
+          <w:szCs w:val="17"/>
+        </w:rPr>
+        <w:t xml:space="preserve">zaman ızgarası               20000. saat     →  Date</w:t>
+      </w:r>
+    </w:p>
+    <w:p>
+      <w:pPr>
+        <w:keepNext w:val="false"/>
+        <w:shd w:fill="F2F4F7" w:color="auto" w:val="clear"/>
+        <w:spacing w:after="160" w:line="240"/>
+        <w:ind w:left="140" w:right="140"/>
+      </w:pPr>
+      <w:r>
+        <w:rPr>
+          <w:rFonts w:ascii="Consolas" w:cs="Consolas" w:eastAsia="Consolas" w:hAnsi="Consolas"/>
+          <w:sz w:val="17"/>
+          <w:szCs w:val="17"/>
+        </w:rPr>
+        <w:t xml:space="preserve">1_temperature.txt, 1_totLoad.txt  aynı Date  →  Temperature, TotLoad, …</w:t>
+      </w:r>
+    </w:p>
+    <w:p>
+      <w:pPr>
+        <w:spacing w:after="120" w:line="288"/>
+        <w:jc w:val="both"/>
+      </w:pPr>
+      <w:r>
+        <w:t xml:space="preserve">Zaman ızgarası veri setinin kendi notebook'larından alındı [N]: 2020-01-01 00:00'dan başlayan saatlik dizi, 29 Şubat'lar çıkarılmış. </w:t>
+      </w:r>
       <w:r>
         <w:rPr>
           <w:rFonts w:ascii="Consolas" w:cs="Consolas" w:eastAsia="Consolas" w:hAnsi="Consolas"/>
@@ -3228,10 +3592,30 @@
           <w:sz w:val="19"/>
           <w:szCs w:val="19"/>
         </w:rPr>
-        <w:t xml:space="preserve">sdof_envanter()</w:t>
-      </w:r>
-      <w:r>
-        <w:t xml:space="preserve"> içindeki birleştirme şöyle çalışıyor:</w:t>
+        <w:t xml:space="preserve">3_SHM.ipynb</w:t>
+      </w:r>
+      <w:r>
+        <w:t xml:space="preserve"> ivme dosyalarını bu dizinin sırasıyla numaralandırıyor (</w:t>
+      </w:r>
+      <w:r>
+        <w:rPr>
+          <w:rFonts w:ascii="Consolas" w:cs="Consolas" w:eastAsia="Consolas" w:hAnsi="Consolas"/>
+          <w:color w:val="7A2E0E"/>
+          <w:sz w:val="19"/>
+          <w:szCs w:val="19"/>
+        </w:rPr>
+        <w:t xml:space="preserve">acc{i:05d}</w:t>
+      </w:r>
+      <w:r>
+        <w:t xml:space="preserve">). Etiket, sıcaklık ve yük sütunları dosyalardaki adları ve değerleriyle aynen bırakıldı.</w:t>
+      </w:r>
+    </w:p>
+    <w:p>
+      <w:pPr>
+        <w:pStyle w:val="Heading1"/>
+      </w:pPr>
+      <w:r>
+        <w:t xml:space="preserve">4. Tek bakışta akış</w:t>
       </w:r>
     </w:p>
     <w:p>
@@ -3247,7 +3631,7 @@
           <w:sz w:val="17"/>
           <w:szCs w:val="17"/>
         </w:rPr>
-        <w:t xml:space="preserve">dosya adı  acc20000-23.h5  →  saat indeksi = 20000</w:t>
+        <w:t xml:space="preserve">GİRDİ                                  İŞLEM                    ÇIKTI (src/output/)</w:t>
       </w:r>
     </w:p>
     <w:p>
@@ -3263,7 +3647,7 @@
           <w:sz w:val="17"/>
           <w:szCs w:val="17"/>
         </w:rPr>
-        <w:t xml:space="preserve">                                   │</w:t>
+        <w:t xml:space="preserve">──────────────────────────────────────────────────────────────────────────────────</w:t>
       </w:r>
     </w:p>
     <w:p>
@@ -3279,7 +3663,7 @@
           <w:sz w:val="17"/>
           <w:szCs w:val="17"/>
         </w:rPr>
-        <w:t xml:space="preserve">labels/4_D2.3_labels.txt   Index=20000  → Label=1, "damage FAST", "-8%"</w:t>
+        <w:t xml:space="preserve">Rt345Bridge.h5 ──────────────────────► rt345_envanter()     ─► rt345_kanal_envanteri.csv</w:t>
       </w:r>
     </w:p>
     <w:p>
@@ -3295,7 +3679,135 @@
           <w:sz w:val="17"/>
           <w:szCs w:val="17"/>
         </w:rPr>
-        <w:t xml:space="preserve">load/1_totLoad.txt         satır 20000  → tarih=2022-04-..., yük</w:t>
+        <w:t xml:space="preserve">                                       rt345_kayit_tablosu()─► rt345_kayit_tablosu.csv</w:t>
+      </w:r>
+    </w:p>
+    <w:p>
+      <w:pPr>
+        <w:keepNext/>
+        <w:shd w:fill="F2F4F7" w:color="auto" w:val="clear"/>
+        <w:spacing w:after="0" w:line="240"/>
+        <w:ind w:left="140" w:right="140"/>
+      </w:pPr>
+      <w:r>
+        <w:rPr>
+          <w:rFonts w:ascii="Consolas" w:cs="Consolas" w:eastAsia="Consolas" w:hAnsi="Consolas"/>
+          <w:sz w:val="17"/>
+          <w:szCs w:val="17"/>
+        </w:rPr>
+        <w:t xml:space="preserve">                                       rt345_ornek_grafik() ─► rt345_A21_ornek.png</w:t>
+      </w:r>
+    </w:p>
+    <w:p>
+      <w:pPr>
+        <w:keepNext/>
+        <w:shd w:fill="F2F4F7" w:color="auto" w:val="clear"/>
+        <w:spacing w:after="0" w:line="240"/>
+        <w:ind w:left="140" w:right="140"/>
+      </w:pPr>
+      <w:r>
+        <w:rPr>
+          <w:rFonts w:ascii="Consolas" w:cs="Consolas" w:eastAsia="Consolas" w:hAnsi="Consolas"/>
+          <w:sz w:val="17"/>
+          <w:szCs w:val="17"/>
+        </w:rPr>
+        <w:t xml:space="preserve"> </w:t>
+      </w:r>
+    </w:p>
+    <w:p>
+      <w:pPr>
+        <w:keepNext/>
+        <w:shd w:fill="F2F4F7" w:color="auto" w:val="clear"/>
+        <w:spacing w:after="0" w:line="240"/>
+        <w:ind w:left="140" w:right="140"/>
+      </w:pPr>
+      <w:r>
+        <w:rPr>
+          <w:rFonts w:ascii="Consolas" w:cs="Consolas" w:eastAsia="Consolas" w:hAnsi="Consolas"/>
+          <w:sz w:val="17"/>
+          <w:szCs w:val="17"/>
+        </w:rPr>
+        <w:t xml:space="preserve">output/acceleration/*.h5 (adları) ──┐</w:t>
+      </w:r>
+    </w:p>
+    <w:p>
+      <w:pPr>
+        <w:keepNext/>
+        <w:shd w:fill="F2F4F7" w:color="auto" w:val="clear"/>
+        <w:spacing w:after="0" w:line="240"/>
+        <w:ind w:left="140" w:right="140"/>
+      </w:pPr>
+      <w:r>
+        <w:rPr>
+          <w:rFonts w:ascii="Consolas" w:cs="Consolas" w:eastAsia="Consolas" w:hAnsi="Consolas"/>
+          <w:sz w:val="17"/>
+          <w:szCs w:val="17"/>
+        </w:rPr>
+        <w:t xml:space="preserve">output/labels/*.txt ────────────────┼► sdof_envanter()      ─► sdof_kayit_envanteri.csv</w:t>
+      </w:r>
+    </w:p>
+    <w:p>
+      <w:pPr>
+        <w:keepNext/>
+        <w:shd w:fill="F2F4F7" w:color="auto" w:val="clear"/>
+        <w:spacing w:after="0" w:line="240"/>
+        <w:ind w:left="140" w:right="140"/>
+      </w:pPr>
+      <w:r>
+        <w:rPr>
+          <w:rFonts w:ascii="Consolas" w:cs="Consolas" w:eastAsia="Consolas" w:hAnsi="Consolas"/>
+          <w:sz w:val="17"/>
+          <w:szCs w:val="17"/>
+        </w:rPr>
+        <w:t xml:space="preserve">input/load/1_totLoad.txt ───────────┤                       ─► sdof_ozet.csv</w:t>
+      </w:r>
+    </w:p>
+    <w:p>
+      <w:pPr>
+        <w:keepNext/>
+        <w:shd w:fill="F2F4F7" w:color="auto" w:val="clear"/>
+        <w:spacing w:after="0" w:line="240"/>
+        <w:ind w:left="140" w:right="140"/>
+      </w:pPr>
+      <w:r>
+        <w:rPr>
+          <w:rFonts w:ascii="Consolas" w:cs="Consolas" w:eastAsia="Consolas" w:hAnsi="Consolas"/>
+          <w:sz w:val="17"/>
+          <w:szCs w:val="17"/>
+        </w:rPr>
+        <w:t xml:space="preserve">input/temperature/1_temperature.txt ┘</w:t>
+      </w:r>
+    </w:p>
+    <w:p>
+      <w:pPr>
+        <w:keepNext/>
+        <w:shd w:fill="F2F4F7" w:color="auto" w:val="clear"/>
+        <w:spacing w:after="0" w:line="240"/>
+        <w:ind w:left="140" w:right="140"/>
+      </w:pPr>
+      <w:r>
+        <w:rPr>
+          <w:rFonts w:ascii="Consolas" w:cs="Consolas" w:eastAsia="Consolas" w:hAnsi="Consolas"/>
+          <w:sz w:val="17"/>
+          <w:szCs w:val="17"/>
+        </w:rPr>
+        <w:t xml:space="preserve">output/acceleration (örnek dosyalar) ► sdof_ornek_grafik()  ─► sdof_ornek.png</w:t>
+      </w:r>
+    </w:p>
+    <w:p>
+      <w:pPr>
+        <w:keepNext/>
+        <w:shd w:fill="F2F4F7" w:color="auto" w:val="clear"/>
+        <w:spacing w:after="0" w:line="240"/>
+        <w:ind w:left="140" w:right="140"/>
+      </w:pPr>
+      <w:r>
+        <w:rPr>
+          <w:rFonts w:ascii="Consolas" w:cs="Consolas" w:eastAsia="Consolas" w:hAnsi="Consolas"/>
+          <w:sz w:val="17"/>
+          <w:szCs w:val="17"/>
+        </w:rPr>
+        <w:t xml:space="preserve"> </w:t>
       </w:r>
     </w:p>
     <w:p>
@@ -3311,7 +3823,15 @@
           <w:sz w:val="17"/>
           <w:szCs w:val="17"/>
         </w:rPr>
-        <w:t xml:space="preserve">temperature/...            aynı tarih   → 14.8 °C</w:t>
+        <w:t xml:space="preserve">input/km_pairs/, output/deflection/ ─► (bu script'te kullanılmadı)</w:t>
+      </w:r>
+    </w:p>
+    <w:p>
+      <w:pPr>
+        <w:pStyle w:val="Heading1"/>
+      </w:pPr>
+      <w:r>
+        <w:t xml:space="preserve">5. Veri dosyası dışından alınan bilgiler ve nedenleri</w:t>
       </w:r>
     </w:p>
     <w:p>
@@ -3320,332 +3840,847 @@
         <w:jc w:val="both"/>
       </w:pPr>
       <w:r>
-        <w:t xml:space="preserve">Ortak anahtar </w:t>
-      </w:r>
-      <w:r>
-        <w:rPr>
-          <w:b/>
-          <w:bCs/>
-        </w:rPr>
-        <w:t xml:space="preserve">saat indeksi</w:t>
-      </w:r>
-      <w:r>
-        <w:t xml:space="preserve">. Dosya adındaki 5 haneli sayı, label dosyasındaki </w:t>
-      </w:r>
-      <w:r>
-        <w:rPr>
-          <w:rFonts w:ascii="Consolas" w:cs="Consolas" w:eastAsia="Consolas" w:hAnsi="Consolas"/>
-          <w:color w:val="7A2E0E"/>
-          <w:sz w:val="19"/>
-          <w:szCs w:val="19"/>
-        </w:rPr>
-        <w:t xml:space="preserve">Index</w:t>
-      </w:r>
-      <w:r>
-        <w:t xml:space="preserve"> ve yük dosyasındaki satır numarası aynı saati gösteriyor. Böylece her ivme dosyası için "ne zaman, hangi koşulda, hangi durumda" bilgisi tek satırda toplanıyor.</w:t>
-      </w:r>
-    </w:p>
-    <w:p>
-      <w:pPr>
-        <w:spacing w:after="120" w:line="288"/>
-        <w:jc w:val="both"/>
-      </w:pPr>
-      <w:r>
-        <w:t xml:space="preserve">Sayısal etiketler okunabilir isimlere çevriliyor (</w:t>
-      </w:r>
-      <w:r>
-        <w:rPr>
-          <w:rFonts w:ascii="Consolas" w:cs="Consolas" w:eastAsia="Consolas" w:hAnsi="Consolas"/>
-          <w:color w:val="7A2E0E"/>
-          <w:sz w:val="19"/>
-          <w:szCs w:val="19"/>
-        </w:rPr>
-        <w:t xml:space="preserve">SDOF_SINIF</w:t>
-      </w:r>
-      <w:r>
-        <w:t xml:space="preserve"> sözlüğü): 0 = sağlıklı, 1 = ani hasar, 2 = yavaş hasar, 4 = ani + yavaş, 7 = sensör arızası.</w:t>
-      </w:r>
-    </w:p>
-    <w:p>
-      <w:pPr>
-        <w:pStyle w:val="Heading1"/>
-      </w:pPr>
-      <w:r>
-        <w:t xml:space="preserve">4. Tek bakışta akış</w:t>
-      </w:r>
-    </w:p>
-    <w:p>
-      <w:pPr>
-        <w:keepNext/>
-        <w:shd w:fill="F2F4F7" w:color="auto" w:val="clear"/>
-        <w:spacing w:after="0" w:line="240"/>
-        <w:ind w:left="140" w:right="140"/>
-      </w:pPr>
-      <w:r>
-        <w:rPr>
-          <w:rFonts w:ascii="Consolas" w:cs="Consolas" w:eastAsia="Consolas" w:hAnsi="Consolas"/>
-          <w:sz w:val="17"/>
-          <w:szCs w:val="17"/>
-        </w:rPr>
-        <w:t xml:space="preserve">GİRDİ                                  İŞLEM                    ÇIKTI (src/output/)</w:t>
-      </w:r>
-    </w:p>
-    <w:p>
-      <w:pPr>
-        <w:keepNext/>
-        <w:shd w:fill="F2F4F7" w:color="auto" w:val="clear"/>
-        <w:spacing w:after="0" w:line="240"/>
-        <w:ind w:left="140" w:right="140"/>
-      </w:pPr>
-      <w:r>
-        <w:rPr>
-          <w:rFonts w:ascii="Consolas" w:cs="Consolas" w:eastAsia="Consolas" w:hAnsi="Consolas"/>
-          <w:sz w:val="17"/>
-          <w:szCs w:val="17"/>
-        </w:rPr>
-        <w:t xml:space="preserve">──────────────────────────────────────────────────────────────────────────────────</w:t>
-      </w:r>
-    </w:p>
-    <w:p>
-      <w:pPr>
-        <w:keepNext/>
-        <w:shd w:fill="F2F4F7" w:color="auto" w:val="clear"/>
-        <w:spacing w:after="0" w:line="240"/>
-        <w:ind w:left="140" w:right="140"/>
-      </w:pPr>
-      <w:r>
-        <w:rPr>
-          <w:rFonts w:ascii="Consolas" w:cs="Consolas" w:eastAsia="Consolas" w:hAnsi="Consolas"/>
-          <w:sz w:val="17"/>
-          <w:szCs w:val="17"/>
-        </w:rPr>
-        <w:t xml:space="preserve">Rt345Bridge.h5 ──────────────────────► rt345_envanter()     ─► rt345_kanal_envanteri.csv</w:t>
-      </w:r>
-    </w:p>
-    <w:p>
-      <w:pPr>
-        <w:keepNext/>
-        <w:shd w:fill="F2F4F7" w:color="auto" w:val="clear"/>
-        <w:spacing w:after="0" w:line="240"/>
-        <w:ind w:left="140" w:right="140"/>
-      </w:pPr>
-      <w:r>
-        <w:rPr>
-          <w:rFonts w:ascii="Consolas" w:cs="Consolas" w:eastAsia="Consolas" w:hAnsi="Consolas"/>
-          <w:sz w:val="17"/>
-          <w:szCs w:val="17"/>
-        </w:rPr>
-        <w:t xml:space="preserve">                                       rt345_kayit_tablosu()─► rt345_kayit_tablosu.csv</w:t>
-      </w:r>
-    </w:p>
-    <w:p>
-      <w:pPr>
-        <w:keepNext/>
-        <w:shd w:fill="F2F4F7" w:color="auto" w:val="clear"/>
-        <w:spacing w:after="0" w:line="240"/>
-        <w:ind w:left="140" w:right="140"/>
-      </w:pPr>
-      <w:r>
-        <w:rPr>
-          <w:rFonts w:ascii="Consolas" w:cs="Consolas" w:eastAsia="Consolas" w:hAnsi="Consolas"/>
-          <w:sz w:val="17"/>
-          <w:szCs w:val="17"/>
-        </w:rPr>
-        <w:t xml:space="preserve">                                       rt345_ornek_grafik() ─► rt345_A21_ornek.png</w:t>
-      </w:r>
-    </w:p>
-    <w:p>
-      <w:pPr>
-        <w:keepNext/>
-        <w:shd w:fill="F2F4F7" w:color="auto" w:val="clear"/>
-        <w:spacing w:after="0" w:line="240"/>
-        <w:ind w:left="140" w:right="140"/>
-      </w:pPr>
-      <w:r>
-        <w:rPr>
-          <w:rFonts w:ascii="Consolas" w:cs="Consolas" w:eastAsia="Consolas" w:hAnsi="Consolas"/>
-          <w:sz w:val="17"/>
-          <w:szCs w:val="17"/>
-        </w:rPr>
-        <w:t xml:space="preserve"> </w:t>
-      </w:r>
-    </w:p>
-    <w:p>
-      <w:pPr>
-        <w:keepNext/>
-        <w:shd w:fill="F2F4F7" w:color="auto" w:val="clear"/>
-        <w:spacing w:after="0" w:line="240"/>
-        <w:ind w:left="140" w:right="140"/>
-      </w:pPr>
-      <w:r>
-        <w:rPr>
-          <w:rFonts w:ascii="Consolas" w:cs="Consolas" w:eastAsia="Consolas" w:hAnsi="Consolas"/>
-          <w:sz w:val="17"/>
-          <w:szCs w:val="17"/>
-        </w:rPr>
-        <w:t xml:space="preserve">output/acceleration/*.h5 (adları) ──┐</w:t>
-      </w:r>
-    </w:p>
-    <w:p>
-      <w:pPr>
-        <w:keepNext/>
-        <w:shd w:fill="F2F4F7" w:color="auto" w:val="clear"/>
-        <w:spacing w:after="0" w:line="240"/>
-        <w:ind w:left="140" w:right="140"/>
-      </w:pPr>
-      <w:r>
-        <w:rPr>
-          <w:rFonts w:ascii="Consolas" w:cs="Consolas" w:eastAsia="Consolas" w:hAnsi="Consolas"/>
-          <w:sz w:val="17"/>
-          <w:szCs w:val="17"/>
-        </w:rPr>
-        <w:t xml:space="preserve">output/labels/*.txt ────────────────┼► sdof_envanter()      ─► sdof_kayit_envanteri.csv</w:t>
-      </w:r>
-    </w:p>
-    <w:p>
-      <w:pPr>
-        <w:keepNext/>
-        <w:shd w:fill="F2F4F7" w:color="auto" w:val="clear"/>
-        <w:spacing w:after="0" w:line="240"/>
-        <w:ind w:left="140" w:right="140"/>
-      </w:pPr>
-      <w:r>
-        <w:rPr>
-          <w:rFonts w:ascii="Consolas" w:cs="Consolas" w:eastAsia="Consolas" w:hAnsi="Consolas"/>
-          <w:sz w:val="17"/>
-          <w:szCs w:val="17"/>
-        </w:rPr>
-        <w:t xml:space="preserve">input/load/1_totLoad.txt ───────────┤                       ─► sdof_ozet.csv</w:t>
-      </w:r>
-    </w:p>
-    <w:p>
-      <w:pPr>
-        <w:keepNext/>
-        <w:shd w:fill="F2F4F7" w:color="auto" w:val="clear"/>
-        <w:spacing w:after="0" w:line="240"/>
-        <w:ind w:left="140" w:right="140"/>
-      </w:pPr>
-      <w:r>
-        <w:rPr>
-          <w:rFonts w:ascii="Consolas" w:cs="Consolas" w:eastAsia="Consolas" w:hAnsi="Consolas"/>
-          <w:sz w:val="17"/>
-          <w:szCs w:val="17"/>
-        </w:rPr>
-        <w:t xml:space="preserve">input/temperature/1_temperature.txt ┘</w:t>
-      </w:r>
-    </w:p>
-    <w:p>
-      <w:pPr>
-        <w:keepNext/>
-        <w:shd w:fill="F2F4F7" w:color="auto" w:val="clear"/>
-        <w:spacing w:after="0" w:line="240"/>
-        <w:ind w:left="140" w:right="140"/>
-      </w:pPr>
-      <w:r>
-        <w:rPr>
-          <w:rFonts w:ascii="Consolas" w:cs="Consolas" w:eastAsia="Consolas" w:hAnsi="Consolas"/>
-          <w:sz w:val="17"/>
-          <w:szCs w:val="17"/>
-        </w:rPr>
-        <w:t xml:space="preserve">output/acceleration/D1, D2_3 ───────► sdof_ornek_grafik()  ─► sdof_ornek.png</w:t>
-      </w:r>
-    </w:p>
-    <w:p>
-      <w:pPr>
-        <w:keepNext/>
-        <w:shd w:fill="F2F4F7" w:color="auto" w:val="clear"/>
-        <w:spacing w:after="0" w:line="240"/>
-        <w:ind w:left="140" w:right="140"/>
-      </w:pPr>
-      <w:r>
-        <w:rPr>
-          <w:rFonts w:ascii="Consolas" w:cs="Consolas" w:eastAsia="Consolas" w:hAnsi="Consolas"/>
-          <w:sz w:val="17"/>
-          <w:szCs w:val="17"/>
-        </w:rPr>
-        <w:t xml:space="preserve"> </w:t>
-      </w:r>
-    </w:p>
-    <w:p>
-      <w:pPr>
-        <w:keepNext/>
-        <w:shd w:fill="F2F4F7" w:color="auto" w:val="clear"/>
-        <w:spacing w:after="0" w:line="240"/>
-        <w:ind w:left="140" w:right="140"/>
-      </w:pPr>
-      <w:r>
-        <w:rPr>
-          <w:rFonts w:ascii="Consolas" w:cs="Consolas" w:eastAsia="Consolas" w:hAnsi="Consolas"/>
-          <w:sz w:val="17"/>
-          <w:szCs w:val="17"/>
-        </w:rPr>
-        <w:t xml:space="preserve">code/*.ipynb ──────────────────────► (kullanılmadı, sadece referans)</w:t>
-      </w:r>
-    </w:p>
-    <w:p>
-      <w:pPr>
-        <w:keepNext/>
-        <w:shd w:fill="F2F4F7" w:color="auto" w:val="clear"/>
-        <w:spacing w:after="0" w:line="240"/>
-        <w:ind w:left="140" w:right="140"/>
-      </w:pPr>
-      <w:r>
-        <w:rPr>
-          <w:rFonts w:ascii="Consolas" w:cs="Consolas" w:eastAsia="Consolas" w:hAnsi="Consolas"/>
-          <w:sz w:val="17"/>
-          <w:szCs w:val="17"/>
-        </w:rPr>
-        <w:t xml:space="preserve">input/km_pairs/ ───────────────────► (kullanılmadı, "gerçek cevap" = kopya riski)</w:t>
-      </w:r>
-    </w:p>
-    <w:p>
-      <w:pPr>
-        <w:keepNext w:val="false"/>
-        <w:shd w:fill="F2F4F7" w:color="auto" w:val="clear"/>
-        <w:spacing w:after="160" w:line="240"/>
-        <w:ind w:left="140" w:right="140"/>
-      </w:pPr>
-      <w:r>
-        <w:rPr>
-          <w:rFonts w:ascii="Consolas" w:cs="Consolas" w:eastAsia="Consolas" w:hAnsi="Consolas"/>
-          <w:sz w:val="17"/>
-          <w:szCs w:val="17"/>
-        </w:rPr>
-        <w:t xml:space="preserve">output/deflection/ ────────────────► (henüz kullanılmadı)</w:t>
-      </w:r>
-    </w:p>
-    <w:p>
-      <w:pPr>
-        <w:pBdr>
-          <w:left w:val="single" w:color="E69500" w:sz="18" w:space="6"/>
-        </w:pBdr>
-        <w:shd w:fill="FFF4E5" w:color="auto" w:val="clear"/>
-        <w:spacing w:after="160" w:before="80" w:line="276"/>
-        <w:ind w:left="140" w:right="140"/>
-      </w:pPr>
-      <w:r>
-        <w:t xml:space="preserve">Bu script veriyi </w:t>
-      </w:r>
-      <w:r>
-        <w:rPr>
-          <w:b/>
-          <w:bCs/>
-        </w:rPr>
-        <w:t xml:space="preserve">değiştirmiyor</w:t>
-      </w:r>
-      <w:r>
-        <w:t xml:space="preserve">, sadece okuyup </w:t>
-      </w:r>
-      <w:r>
-        <w:rPr>
-          <w:b/>
-          <w:bCs/>
-        </w:rPr>
-        <w:t xml:space="preserve">katalog</w:t>
-      </w:r>
-      <w:r>
-        <w:t xml:space="preserve"> çıkarıyor. Orijinal dosyalara dokunulmuyor. Sonraki adımlarda (ön işleme, özellik çıkarma) bu CSV'ler "hangi dosyayı hangi rolde kullanacağım" sorusunun cevabı olacak.</w:t>
-      </w:r>
+        <w:t xml:space="preserve">Aşağıdakiler veri dosyalarının içinde yazmıyor. Makaleden veya veri setinin kendi notebook'larından alındı. Her birinin neden eklendiği yanında yazıyor:</w:t>
+      </w:r>
+    </w:p>
+    <w:tbl>
+      <w:tblPr>
+        <w:tblW w:type="dxa" w:w="9638"/>
+        <w:tblBorders>
+          <w:top w:val="single" w:color="auto" w:sz="4"/>
+          <w:left w:val="single" w:color="auto" w:sz="4"/>
+          <w:bottom w:val="single" w:color="auto" w:sz="4"/>
+          <w:right w:val="single" w:color="auto" w:sz="4"/>
+          <w:insideH w:val="single" w:color="auto" w:sz="4"/>
+          <w:insideV w:val="single" w:color="auto" w:sz="4"/>
+        </w:tblBorders>
+      </w:tblPr>
+      <w:tblGrid>
+        <w:gridCol w:w="2600"/>
+        <w:gridCol w:w="2000"/>
+        <w:gridCol w:w="5038"/>
+      </w:tblGrid>
+      <w:tr>
+        <w:trPr>
+          <w:tblHeader/>
+        </w:trPr>
+        <w:tc>
+          <w:tcPr>
+            <w:tcW w:type="dxa" w:w="2600"/>
+            <w:tcBorders>
+              <w:top w:val="single" w:color="BFC7D1" w:sz="4"/>
+              <w:left w:val="single" w:color="BFC7D1" w:sz="4"/>
+              <w:bottom w:val="single" w:color="BFC7D1" w:sz="4"/>
+              <w:right w:val="single" w:color="BFC7D1" w:sz="4"/>
+            </w:tcBorders>
+            <w:shd w:fill="1F4E79" w:color="auto" w:val="clear"/>
+            <w:tcMar>
+              <w:top w:type="dxa" w:w="60"/>
+              <w:left w:type="dxa" w:w="100"/>
+              <w:bottom w:type="dxa" w:w="60"/>
+              <w:right w:type="dxa" w:w="100"/>
+            </w:tcMar>
+          </w:tcPr>
+          <w:p>
+            <w:pPr>
+              <w:spacing w:after="0" w:line="252"/>
+            </w:pPr>
+            <w:r>
+              <w:rPr>
+                <w:b/>
+                <w:bCs/>
+                <w:color w:val="FFFFFF"/>
+                <w:sz w:val="19"/>
+                <w:szCs w:val="19"/>
+              </w:rPr>
+              <w:t xml:space="preserve">Bilgi</w:t>
+            </w:r>
+          </w:p>
+        </w:tc>
+        <w:tc>
+          <w:tcPr>
+            <w:tcW w:type="dxa" w:w="2000"/>
+            <w:tcBorders>
+              <w:top w:val="single" w:color="BFC7D1" w:sz="4"/>
+              <w:left w:val="single" w:color="BFC7D1" w:sz="4"/>
+              <w:bottom w:val="single" w:color="BFC7D1" w:sz="4"/>
+              <w:right w:val="single" w:color="BFC7D1" w:sz="4"/>
+            </w:tcBorders>
+            <w:shd w:fill="1F4E79" w:color="auto" w:val="clear"/>
+            <w:tcMar>
+              <w:top w:type="dxa" w:w="60"/>
+              <w:left w:type="dxa" w:w="100"/>
+              <w:bottom w:type="dxa" w:w="60"/>
+              <w:right w:type="dxa" w:w="100"/>
+            </w:tcMar>
+          </w:tcPr>
+          <w:p>
+            <w:pPr>
+              <w:spacing w:after="0" w:line="252"/>
+            </w:pPr>
+            <w:r>
+              <w:rPr>
+                <w:b/>
+                <w:bCs/>
+                <w:color w:val="FFFFFF"/>
+                <w:sz w:val="19"/>
+                <w:szCs w:val="19"/>
+              </w:rPr>
+              <w:t xml:space="preserve">Kaynak</w:t>
+            </w:r>
+          </w:p>
+        </w:tc>
+        <w:tc>
+          <w:tcPr>
+            <w:tcW w:type="dxa" w:w="5038"/>
+            <w:tcBorders>
+              <w:top w:val="single" w:color="BFC7D1" w:sz="4"/>
+              <w:left w:val="single" w:color="BFC7D1" w:sz="4"/>
+              <w:bottom w:val="single" w:color="BFC7D1" w:sz="4"/>
+              <w:right w:val="single" w:color="BFC7D1" w:sz="4"/>
+            </w:tcBorders>
+            <w:shd w:fill="1F4E79" w:color="auto" w:val="clear"/>
+            <w:tcMar>
+              <w:top w:type="dxa" w:w="60"/>
+              <w:left w:type="dxa" w:w="100"/>
+              <w:bottom w:type="dxa" w:w="60"/>
+              <w:right w:type="dxa" w:w="100"/>
+            </w:tcMar>
+          </w:tcPr>
+          <w:p>
+            <w:pPr>
+              <w:spacing w:after="0" w:line="252"/>
+            </w:pPr>
+            <w:r>
+              <w:rPr>
+                <w:b/>
+                <w:bCs/>
+                <w:color w:val="FFFFFF"/>
+                <w:sz w:val="19"/>
+                <w:szCs w:val="19"/>
+              </w:rPr>
+              <w:t xml:space="preserve">Neden eklendi</w:t>
+            </w:r>
+          </w:p>
+        </w:tc>
+      </w:tr>
+      <w:tr>
+        <w:tc>
+          <w:tcPr>
+            <w:tcW w:type="dxa" w:w="2600"/>
+            <w:tcBorders>
+              <w:top w:val="single" w:color="BFC7D1" w:sz="4"/>
+              <w:left w:val="single" w:color="BFC7D1" w:sz="4"/>
+              <w:bottom w:val="single" w:color="BFC7D1" w:sz="4"/>
+              <w:right w:val="single" w:color="BFC7D1" w:sz="4"/>
+            </w:tcBorders>
+            <w:tcMar>
+              <w:top w:type="dxa" w:w="60"/>
+              <w:left w:type="dxa" w:w="100"/>
+              <w:bottom w:type="dxa" w:w="60"/>
+              <w:right w:type="dxa" w:w="100"/>
+            </w:tcMar>
+          </w:tcPr>
+          <w:p>
+            <w:pPr>
+              <w:spacing w:after="0" w:line="252"/>
+            </w:pPr>
+            <w:r>
+              <w:rPr>
+                <w:sz w:val="19"/>
+                <w:szCs w:val="19"/>
+              </w:rPr>
+              <w:t xml:space="preserve">Senaryoların deney sırası ve case numaraları (1–8)</w:t>
+            </w:r>
+          </w:p>
+        </w:tc>
+        <w:tc>
+          <w:tcPr>
+            <w:tcW w:type="dxa" w:w="2000"/>
+            <w:tcBorders>
+              <w:top w:val="single" w:color="BFC7D1" w:sz="4"/>
+              <w:left w:val="single" w:color="BFC7D1" w:sz="4"/>
+              <w:bottom w:val="single" w:color="BFC7D1" w:sz="4"/>
+              <w:right w:val="single" w:color="BFC7D1" w:sz="4"/>
+            </w:tcBorders>
+            <w:tcMar>
+              <w:top w:type="dxa" w:w="60"/>
+              <w:left w:type="dxa" w:w="100"/>
+              <w:bottom w:type="dxa" w:w="60"/>
+              <w:right w:type="dxa" w:w="100"/>
+            </w:tcMar>
+          </w:tcPr>
+          <w:p>
+            <w:pPr>
+              <w:spacing w:after="0" w:line="252"/>
+            </w:pPr>
+            <w:r>
+              <w:rPr>
+                <w:sz w:val="19"/>
+                <w:szCs w:val="19"/>
+              </w:rPr>
+              <w:t xml:space="preserve">[M] Tablo 2</w:t>
+            </w:r>
+          </w:p>
+        </w:tc>
+        <w:tc>
+          <w:tcPr>
+            <w:tcW w:type="dxa" w:w="5038"/>
+            <w:tcBorders>
+              <w:top w:val="single" w:color="BFC7D1" w:sz="4"/>
+              <w:left w:val="single" w:color="BFC7D1" w:sz="4"/>
+              <w:bottom w:val="single" w:color="BFC7D1" w:sz="4"/>
+              <w:right w:val="single" w:color="BFC7D1" w:sz="4"/>
+            </w:tcBorders>
+            <w:tcMar>
+              <w:top w:type="dxa" w:w="60"/>
+              <w:left w:type="dxa" w:w="100"/>
+              <w:bottom w:type="dxa" w:w="60"/>
+              <w:right w:type="dxa" w:w="100"/>
+            </w:tcMar>
+          </w:tcPr>
+          <w:p>
+            <w:pPr>
+              <w:spacing w:after="0" w:line="252"/>
+            </w:pPr>
+            <w:r>
+              <w:rPr>
+                <w:sz w:val="19"/>
+                <w:szCs w:val="19"/>
+              </w:rPr>
+              <w:t xml:space="preserve">h5'teki gruplar alfabetik sıralı (baseline_1, baseline_2, damage_1 …). Deneyin gerçek sırası (örn. baseline_2'nin damage_2'den sonra alındığı) sadece makalede yazıyor.</w:t>
+            </w:r>
+          </w:p>
+        </w:tc>
+      </w:tr>
+      <w:tr>
+        <w:tc>
+          <w:tcPr>
+            <w:tcW w:type="dxa" w:w="2600"/>
+            <w:tcBorders>
+              <w:top w:val="single" w:color="BFC7D1" w:sz="4"/>
+              <w:left w:val="single" w:color="BFC7D1" w:sz="4"/>
+              <w:bottom w:val="single" w:color="BFC7D1" w:sz="4"/>
+              <w:right w:val="single" w:color="BFC7D1" w:sz="4"/>
+            </w:tcBorders>
+            <w:tcMar>
+              <w:top w:type="dxa" w:w="60"/>
+              <w:left w:type="dxa" w:w="100"/>
+              <w:bottom w:type="dxa" w:w="60"/>
+              <w:right w:type="dxa" w:w="100"/>
+            </w:tcMar>
+          </w:tcPr>
+          <w:p>
+            <w:pPr>
+              <w:spacing w:after="0" w:line="252"/>
+            </w:pPr>
+            <w:r>
+              <w:rPr>
+                <w:sz w:val="19"/>
+                <w:szCs w:val="19"/>
+              </w:rPr>
+              <w:t xml:space="preserve">Sensörün ölçüm aralığı ±2 g</w:t>
+            </w:r>
+          </w:p>
+        </w:tc>
+        <w:tc>
+          <w:tcPr>
+            <w:tcW w:type="dxa" w:w="2000"/>
+            <w:tcBorders>
+              <w:top w:val="single" w:color="BFC7D1" w:sz="4"/>
+              <w:left w:val="single" w:color="BFC7D1" w:sz="4"/>
+              <w:bottom w:val="single" w:color="BFC7D1" w:sz="4"/>
+              <w:right w:val="single" w:color="BFC7D1" w:sz="4"/>
+            </w:tcBorders>
+            <w:tcMar>
+              <w:top w:type="dxa" w:w="60"/>
+              <w:left w:type="dxa" w:w="100"/>
+              <w:bottom w:type="dxa" w:w="60"/>
+              <w:right w:type="dxa" w:w="100"/>
+            </w:tcMar>
+          </w:tcPr>
+          <w:p>
+            <w:pPr>
+              <w:spacing w:after="0" w:line="252"/>
+            </w:pPr>
+            <w:r>
+              <w:rPr>
+                <w:sz w:val="19"/>
+                <w:szCs w:val="19"/>
+              </w:rPr>
+              <w:t xml:space="preserve">[M] "Vibration Monitoring System" bölümü</w:t>
+            </w:r>
+          </w:p>
+        </w:tc>
+        <w:tc>
+          <w:tcPr>
+            <w:tcW w:type="dxa" w:w="5038"/>
+            <w:tcBorders>
+              <w:top w:val="single" w:color="BFC7D1" w:sz="4"/>
+              <w:left w:val="single" w:color="BFC7D1" w:sz="4"/>
+              <w:bottom w:val="single" w:color="BFC7D1" w:sz="4"/>
+              <w:right w:val="single" w:color="BFC7D1" w:sz="4"/>
+            </w:tcBorders>
+            <w:tcMar>
+              <w:top w:type="dxa" w:w="60"/>
+              <w:left w:type="dxa" w:w="100"/>
+              <w:bottom w:type="dxa" w:w="60"/>
+              <w:right w:type="dxa" w:w="100"/>
+            </w:tcMar>
+          </w:tcPr>
+          <w:p>
+            <w:pPr>
+              <w:spacing w:after="0" w:line="252"/>
+            </w:pPr>
+            <w:r>
+              <w:rPr>
+                <w:sz w:val="19"/>
+                <w:szCs w:val="19"/>
+              </w:rPr>
+              <w:t xml:space="preserve">h5'te sensör tipi (LIS2L02AL) yazıyor ama ölçüm aralığı yazmıyor. olcum_araligi_asildi sütunu bu değerle hesaplanıyor.</w:t>
+            </w:r>
+          </w:p>
+        </w:tc>
+      </w:tr>
+      <w:tr>
+        <w:tc>
+          <w:tcPr>
+            <w:tcW w:type="dxa" w:w="2600"/>
+            <w:tcBorders>
+              <w:top w:val="single" w:color="BFC7D1" w:sz="4"/>
+              <w:left w:val="single" w:color="BFC7D1" w:sz="4"/>
+              <w:bottom w:val="single" w:color="BFC7D1" w:sz="4"/>
+              <w:right w:val="single" w:color="BFC7D1" w:sz="4"/>
+            </w:tcBorders>
+            <w:tcMar>
+              <w:top w:type="dxa" w:w="60"/>
+              <w:left w:type="dxa" w:w="100"/>
+              <w:bottom w:type="dxa" w:w="60"/>
+              <w:right w:type="dxa" w:w="100"/>
+            </w:tcMar>
+          </w:tcPr>
+          <w:p>
+            <w:pPr>
+              <w:spacing w:after="0" w:line="252"/>
+            </w:pPr>
+            <w:r>
+              <w:rPr>
+                <w:sz w:val="19"/>
+                <w:szCs w:val="19"/>
+              </w:rPr>
+              <w:t xml:space="preserve">A14, damage_6'da veri göndermedi</w:t>
+            </w:r>
+          </w:p>
+        </w:tc>
+        <w:tc>
+          <w:tcPr>
+            <w:tcW w:type="dxa" w:w="2000"/>
+            <w:tcBorders>
+              <w:top w:val="single" w:color="BFC7D1" w:sz="4"/>
+              <w:left w:val="single" w:color="BFC7D1" w:sz="4"/>
+              <w:bottom w:val="single" w:color="BFC7D1" w:sz="4"/>
+              <w:right w:val="single" w:color="BFC7D1" w:sz="4"/>
+            </w:tcBorders>
+            <w:tcMar>
+              <w:top w:type="dxa" w:w="60"/>
+              <w:left w:type="dxa" w:w="100"/>
+              <w:bottom w:type="dxa" w:w="60"/>
+              <w:right w:type="dxa" w:w="100"/>
+            </w:tcMar>
+          </w:tcPr>
+          <w:p>
+            <w:pPr>
+              <w:spacing w:after="0" w:line="252"/>
+            </w:pPr>
+            <w:r>
+              <w:rPr>
+                <w:sz w:val="19"/>
+                <w:szCs w:val="19"/>
+              </w:rPr>
+              <w:t xml:space="preserve">[M] "Processing of Measurement Data" bölümü</w:t>
+            </w:r>
+          </w:p>
+        </w:tc>
+        <w:tc>
+          <w:tcPr>
+            <w:tcW w:type="dxa" w:w="5038"/>
+            <w:tcBorders>
+              <w:top w:val="single" w:color="BFC7D1" w:sz="4"/>
+              <w:left w:val="single" w:color="BFC7D1" w:sz="4"/>
+              <w:bottom w:val="single" w:color="BFC7D1" w:sz="4"/>
+              <w:right w:val="single" w:color="BFC7D1" w:sz="4"/>
+            </w:tcBorders>
+            <w:tcMar>
+              <w:top w:type="dxa" w:w="60"/>
+              <w:left w:type="dxa" w:w="100"/>
+              <w:bottom w:type="dxa" w:w="60"/>
+              <w:right w:type="dxa" w:w="100"/>
+            </w:tcMar>
+          </w:tcPr>
+          <w:p>
+            <w:pPr>
+              <w:spacing w:after="0" w:line="252"/>
+            </w:pPr>
+            <w:r>
+              <w:rPr>
+                <w:sz w:val="19"/>
+                <w:szCs w:val="19"/>
+              </w:rPr>
+              <w:t xml:space="preserve">Dosyada bu kanal sıfırlarla dolu. Bunun bir ölçüm sonucu değil, eksik veri olduğu makalede açıklanıyor.</w:t>
+            </w:r>
+          </w:p>
+        </w:tc>
+      </w:tr>
+      <w:tr>
+        <w:tc>
+          <w:tcPr>
+            <w:tcW w:type="dxa" w:w="2600"/>
+            <w:tcBorders>
+              <w:top w:val="single" w:color="BFC7D1" w:sz="4"/>
+              <w:left w:val="single" w:color="BFC7D1" w:sz="4"/>
+              <w:bottom w:val="single" w:color="BFC7D1" w:sz="4"/>
+              <w:right w:val="single" w:color="BFC7D1" w:sz="4"/>
+            </w:tcBorders>
+            <w:tcMar>
+              <w:top w:type="dxa" w:w="60"/>
+              <w:left w:type="dxa" w:w="100"/>
+              <w:bottom w:type="dxa" w:w="60"/>
+              <w:right w:type="dxa" w:w="100"/>
+            </w:tcMar>
+          </w:tcPr>
+          <w:p>
+            <w:pPr>
+              <w:spacing w:after="0" w:line="252"/>
+            </w:pPr>
+            <w:r>
+              <w:rPr>
+                <w:sz w:val="19"/>
+                <w:szCs w:val="19"/>
+              </w:rPr>
+              <w:t xml:space="preserve">Grafikte A21 sensörünün seçilmesi</w:t>
+            </w:r>
+          </w:p>
+        </w:tc>
+        <w:tc>
+          <w:tcPr>
+            <w:tcW w:type="dxa" w:w="2000"/>
+            <w:tcBorders>
+              <w:top w:val="single" w:color="BFC7D1" w:sz="4"/>
+              <w:left w:val="single" w:color="BFC7D1" w:sz="4"/>
+              <w:bottom w:val="single" w:color="BFC7D1" w:sz="4"/>
+              <w:right w:val="single" w:color="BFC7D1" w:sz="4"/>
+            </w:tcBorders>
+            <w:tcMar>
+              <w:top w:type="dxa" w:w="60"/>
+              <w:left w:type="dxa" w:w="100"/>
+              <w:bottom w:type="dxa" w:w="60"/>
+              <w:right w:type="dxa" w:w="100"/>
+            </w:tcMar>
+          </w:tcPr>
+          <w:p>
+            <w:pPr>
+              <w:spacing w:after="0" w:line="252"/>
+            </w:pPr>
+            <w:r>
+              <w:rPr>
+                <w:sz w:val="19"/>
+                <w:szCs w:val="19"/>
+              </w:rPr>
+              <w:t xml:space="preserve">[M] Fig. 6a</w:t>
+            </w:r>
+          </w:p>
+        </w:tc>
+        <w:tc>
+          <w:tcPr>
+            <w:tcW w:type="dxa" w:w="5038"/>
+            <w:tcBorders>
+              <w:top w:val="single" w:color="BFC7D1" w:sz="4"/>
+              <w:left w:val="single" w:color="BFC7D1" w:sz="4"/>
+              <w:bottom w:val="single" w:color="BFC7D1" w:sz="4"/>
+              <w:right w:val="single" w:color="BFC7D1" w:sz="4"/>
+            </w:tcBorders>
+            <w:tcMar>
+              <w:top w:type="dxa" w:w="60"/>
+              <w:left w:type="dxa" w:w="100"/>
+              <w:bottom w:type="dxa" w:w="60"/>
+              <w:right w:type="dxa" w:w="100"/>
+            </w:tcMar>
+          </w:tcPr>
+          <w:p>
+            <w:pPr>
+              <w:spacing w:after="0" w:line="252"/>
+            </w:pPr>
+            <w:r>
+              <w:rPr>
+                <w:sz w:val="19"/>
+                <w:szCs w:val="19"/>
+              </w:rPr>
+              <w:t xml:space="preserve">Makale örnek veri olarak bu sensörü gösteriyor. Aynı sensörü çizmek, grafiği makaleyle karşılaştırılabilir kılıyor.</w:t>
+            </w:r>
+          </w:p>
+        </w:tc>
+      </w:tr>
+      <w:tr>
+        <w:tc>
+          <w:tcPr>
+            <w:tcW w:type="dxa" w:w="2600"/>
+            <w:tcBorders>
+              <w:top w:val="single" w:color="BFC7D1" w:sz="4"/>
+              <w:left w:val="single" w:color="BFC7D1" w:sz="4"/>
+              <w:bottom w:val="single" w:color="BFC7D1" w:sz="4"/>
+              <w:right w:val="single" w:color="BFC7D1" w:sz="4"/>
+            </w:tcBorders>
+            <w:tcMar>
+              <w:top w:type="dxa" w:w="60"/>
+              <w:left w:type="dxa" w:w="100"/>
+              <w:bottom w:type="dxa" w:w="60"/>
+              <w:right w:type="dxa" w:w="100"/>
+            </w:tcMar>
+          </w:tcPr>
+          <w:p>
+            <w:pPr>
+              <w:spacing w:after="0" w:line="252"/>
+            </w:pPr>
+            <w:r>
+              <w:rPr>
+                <w:sz w:val="19"/>
+                <w:szCs w:val="19"/>
+              </w:rPr>
+              <w:t xml:space="preserve">SDOF zaman ızgarası (29 Şubat'sız saatlik dizi)</w:t>
+            </w:r>
+          </w:p>
+        </w:tc>
+        <w:tc>
+          <w:tcPr>
+            <w:tcW w:type="dxa" w:w="2000"/>
+            <w:tcBorders>
+              <w:top w:val="single" w:color="BFC7D1" w:sz="4"/>
+              <w:left w:val="single" w:color="BFC7D1" w:sz="4"/>
+              <w:bottom w:val="single" w:color="BFC7D1" w:sz="4"/>
+              <w:right w:val="single" w:color="BFC7D1" w:sz="4"/>
+            </w:tcBorders>
+            <w:tcMar>
+              <w:top w:type="dxa" w:w="60"/>
+              <w:left w:type="dxa" w:w="100"/>
+              <w:bottom w:type="dxa" w:w="60"/>
+              <w:right w:type="dxa" w:w="100"/>
+            </w:tcMar>
+          </w:tcPr>
+          <w:p>
+            <w:pPr>
+              <w:spacing w:after="0" w:line="252"/>
+            </w:pPr>
+            <w:r>
+              <w:rPr>
+                <w:sz w:val="19"/>
+                <w:szCs w:val="19"/>
+              </w:rPr>
+              <w:t xml:space="preserve">[N] 1_EOVs, 2_SDOF, 3_SHM</w:t>
+            </w:r>
+          </w:p>
+        </w:tc>
+        <w:tc>
+          <w:tcPr>
+            <w:tcW w:type="dxa" w:w="5038"/>
+            <w:tcBorders>
+              <w:top w:val="single" w:color="BFC7D1" w:sz="4"/>
+              <w:left w:val="single" w:color="BFC7D1" w:sz="4"/>
+              <w:bottom w:val="single" w:color="BFC7D1" w:sz="4"/>
+              <w:right w:val="single" w:color="BFC7D1" w:sz="4"/>
+            </w:tcBorders>
+            <w:tcMar>
+              <w:top w:type="dxa" w:w="60"/>
+              <w:left w:type="dxa" w:w="100"/>
+              <w:bottom w:type="dxa" w:w="60"/>
+              <w:right w:type="dxa" w:w="100"/>
+            </w:tcMar>
+          </w:tcPr>
+          <w:p>
+            <w:pPr>
+              <w:spacing w:after="0" w:line="252"/>
+            </w:pPr>
+            <w:r>
+              <w:rPr>
+                <w:sz w:val="19"/>
+                <w:szCs w:val="19"/>
+              </w:rPr>
+              <w:t xml:space="preserve">Dosya adındaki numaranın hangi tarihe karşılık geldiği veri dosyalarında yazmıyor; notebook'larda tanımlı.</w:t>
+            </w:r>
+          </w:p>
+        </w:tc>
+      </w:tr>
+      <w:tr>
+        <w:tc>
+          <w:tcPr>
+            <w:tcW w:type="dxa" w:w="2600"/>
+            <w:tcBorders>
+              <w:top w:val="single" w:color="BFC7D1" w:sz="4"/>
+              <w:left w:val="single" w:color="BFC7D1" w:sz="4"/>
+              <w:bottom w:val="single" w:color="BFC7D1" w:sz="4"/>
+              <w:right w:val="single" w:color="BFC7D1" w:sz="4"/>
+            </w:tcBorders>
+            <w:tcMar>
+              <w:top w:type="dxa" w:w="60"/>
+              <w:left w:type="dxa" w:w="100"/>
+              <w:bottom w:type="dxa" w:w="60"/>
+              <w:right w:type="dxa" w:w="100"/>
+            </w:tcMar>
+          </w:tcPr>
+          <w:p>
+            <w:pPr>
+              <w:spacing w:after="0" w:line="252"/>
+            </w:pPr>
+            <w:r>
+              <w:rPr>
+                <w:sz w:val="19"/>
+                <w:szCs w:val="19"/>
+              </w:rPr>
+              <w:t xml:space="preserve">km_pairs sütunları: 0 = rijitlik, 1 = kütle</w:t>
+            </w:r>
+          </w:p>
+        </w:tc>
+        <w:tc>
+          <w:tcPr>
+            <w:tcW w:type="dxa" w:w="2000"/>
+            <w:tcBorders>
+              <w:top w:val="single" w:color="BFC7D1" w:sz="4"/>
+              <w:left w:val="single" w:color="BFC7D1" w:sz="4"/>
+              <w:bottom w:val="single" w:color="BFC7D1" w:sz="4"/>
+              <w:right w:val="single" w:color="BFC7D1" w:sz="4"/>
+            </w:tcBorders>
+            <w:tcMar>
+              <w:top w:type="dxa" w:w="60"/>
+              <w:left w:type="dxa" w:w="100"/>
+              <w:bottom w:type="dxa" w:w="60"/>
+              <w:right w:type="dxa" w:w="100"/>
+            </w:tcMar>
+          </w:tcPr>
+          <w:p>
+            <w:pPr>
+              <w:spacing w:after="0" w:line="252"/>
+            </w:pPr>
+            <w:r>
+              <w:rPr>
+                <w:sz w:val="19"/>
+                <w:szCs w:val="19"/>
+              </w:rPr>
+              <w:t xml:space="preserve">[N] 2_SDOF</w:t>
+            </w:r>
+          </w:p>
+        </w:tc>
+        <w:tc>
+          <w:tcPr>
+            <w:tcW w:type="dxa" w:w="5038"/>
+            <w:tcBorders>
+              <w:top w:val="single" w:color="BFC7D1" w:sz="4"/>
+              <w:left w:val="single" w:color="BFC7D1" w:sz="4"/>
+              <w:bottom w:val="single" w:color="BFC7D1" w:sz="4"/>
+              <w:right w:val="single" w:color="BFC7D1" w:sz="4"/>
+            </w:tcBorders>
+            <w:tcMar>
+              <w:top w:type="dxa" w:w="60"/>
+              <w:left w:type="dxa" w:w="100"/>
+              <w:bottom w:type="dxa" w:w="60"/>
+              <w:right w:type="dxa" w:w="100"/>
+            </w:tcMar>
+          </w:tcPr>
+          <w:p>
+            <w:pPr>
+              <w:spacing w:after="0" w:line="252"/>
+            </w:pPr>
+            <w:r>
+              <w:rPr>
+                <w:sz w:val="19"/>
+                <w:szCs w:val="19"/>
+              </w:rPr>
+              <w:t xml:space="preserve">km_pairs dosyalarında başlık satırı yok; sütun anlamları notebook'ta görülüyor.</w:t>
+            </w:r>
+          </w:p>
+        </w:tc>
+      </w:tr>
+      <w:tr>
+        <w:tc>
+          <w:tcPr>
+            <w:tcW w:type="dxa" w:w="2600"/>
+            <w:tcBorders>
+              <w:top w:val="single" w:color="BFC7D1" w:sz="4"/>
+              <w:left w:val="single" w:color="BFC7D1" w:sz="4"/>
+              <w:bottom w:val="single" w:color="BFC7D1" w:sz="4"/>
+              <w:right w:val="single" w:color="BFC7D1" w:sz="4"/>
+            </w:tcBorders>
+            <w:tcMar>
+              <w:top w:type="dxa" w:w="60"/>
+              <w:left w:type="dxa" w:w="100"/>
+              <w:bottom w:type="dxa" w:w="60"/>
+              <w:right w:type="dxa" w:w="100"/>
+            </w:tcMar>
+          </w:tcPr>
+          <w:p>
+            <w:pPr>
+              <w:spacing w:after="0" w:line="252"/>
+            </w:pPr>
+            <w:r>
+              <w:rPr>
+                <w:sz w:val="19"/>
+                <w:szCs w:val="19"/>
+              </w:rPr>
+              <w:t xml:space="preserve">SDOF grafiğinde acc00000-1.h5</w:t>
+            </w:r>
+          </w:p>
+        </w:tc>
+        <w:tc>
+          <w:tcPr>
+            <w:tcW w:type="dxa" w:w="2000"/>
+            <w:tcBorders>
+              <w:top w:val="single" w:color="BFC7D1" w:sz="4"/>
+              <w:left w:val="single" w:color="BFC7D1" w:sz="4"/>
+              <w:bottom w:val="single" w:color="BFC7D1" w:sz="4"/>
+              <w:right w:val="single" w:color="BFC7D1" w:sz="4"/>
+            </w:tcBorders>
+            <w:tcMar>
+              <w:top w:type="dxa" w:w="60"/>
+              <w:left w:type="dxa" w:w="100"/>
+              <w:bottom w:type="dxa" w:w="60"/>
+              <w:right w:type="dxa" w:w="100"/>
+            </w:tcMar>
+          </w:tcPr>
+          <w:p>
+            <w:pPr>
+              <w:spacing w:after="0" w:line="252"/>
+            </w:pPr>
+            <w:r>
+              <w:rPr>
+                <w:sz w:val="19"/>
+                <w:szCs w:val="19"/>
+              </w:rPr>
+              <w:t xml:space="preserve">[N] 4_SFM</w:t>
+            </w:r>
+          </w:p>
+        </w:tc>
+        <w:tc>
+          <w:tcPr>
+            <w:tcW w:type="dxa" w:w="5038"/>
+            <w:tcBorders>
+              <w:top w:val="single" w:color="BFC7D1" w:sz="4"/>
+              <w:left w:val="single" w:color="BFC7D1" w:sz="4"/>
+              <w:bottom w:val="single" w:color="BFC7D1" w:sz="4"/>
+              <w:right w:val="single" w:color="BFC7D1" w:sz="4"/>
+            </w:tcBorders>
+            <w:tcMar>
+              <w:top w:type="dxa" w:w="60"/>
+              <w:left w:type="dxa" w:w="100"/>
+              <w:bottom w:type="dxa" w:w="60"/>
+              <w:right w:type="dxa" w:w="100"/>
+            </w:tcMar>
+          </w:tcPr>
+          <w:p>
+            <w:pPr>
+              <w:spacing w:after="0" w:line="252"/>
+            </w:pPr>
+            <w:r>
+              <w:rPr>
+                <w:sz w:val="19"/>
+                <w:szCs w:val="19"/>
+              </w:rPr>
+              <w:t xml:space="preserve">Veri setinin kendi notebook'u bu dosyayı örnek olarak açıyor.</w:t>
+            </w:r>
+          </w:p>
+        </w:tc>
+      </w:tr>
+      <w:tr>
+        <w:tc>
+          <w:tcPr>
+            <w:tcW w:type="dxa" w:w="2600"/>
+            <w:tcBorders>
+              <w:top w:val="single" w:color="BFC7D1" w:sz="4"/>
+              <w:left w:val="single" w:color="BFC7D1" w:sz="4"/>
+              <w:bottom w:val="single" w:color="BFC7D1" w:sz="4"/>
+              <w:right w:val="single" w:color="BFC7D1" w:sz="4"/>
+            </w:tcBorders>
+            <w:tcMar>
+              <w:top w:type="dxa" w:w="60"/>
+              <w:left w:type="dxa" w:w="100"/>
+              <w:bottom w:type="dxa" w:w="60"/>
+              <w:right w:type="dxa" w:w="100"/>
+            </w:tcMar>
+          </w:tcPr>
+          <w:p>
+            <w:pPr>
+              <w:spacing w:after="0" w:line="252"/>
+            </w:pPr>
+            <w:r>
+              <w:rPr>
+                <w:sz w:val="19"/>
+                <w:szCs w:val="19"/>
+              </w:rPr>
+              <w:t xml:space="preserve">SDOF grafiğinde saat 26278</w:t>
+            </w:r>
+          </w:p>
+        </w:tc>
+        <w:tc>
+          <w:tcPr>
+            <w:tcW w:type="dxa" w:w="2000"/>
+            <w:tcBorders>
+              <w:top w:val="single" w:color="BFC7D1" w:sz="4"/>
+              <w:left w:val="single" w:color="BFC7D1" w:sz="4"/>
+              <w:bottom w:val="single" w:color="BFC7D1" w:sz="4"/>
+              <w:right w:val="single" w:color="BFC7D1" w:sz="4"/>
+            </w:tcBorders>
+            <w:tcMar>
+              <w:top w:type="dxa" w:w="60"/>
+              <w:left w:type="dxa" w:w="100"/>
+              <w:bottom w:type="dxa" w:w="60"/>
+              <w:right w:type="dxa" w:w="100"/>
+            </w:tcMar>
+          </w:tcPr>
+          <w:p>
+            <w:pPr>
+              <w:spacing w:after="0" w:line="252"/>
+            </w:pPr>
+            <w:r>
+              <w:rPr>
+                <w:sz w:val="19"/>
+                <w:szCs w:val="19"/>
+              </w:rPr>
+              <w:t xml:space="preserve">[V]</w:t>
+            </w:r>
+          </w:p>
+        </w:tc>
+        <w:tc>
+          <w:tcPr>
+            <w:tcW w:type="dxa" w:w="5038"/>
+            <w:tcBorders>
+              <w:top w:val="single" w:color="BFC7D1" w:sz="4"/>
+              <w:left w:val="single" w:color="BFC7D1" w:sz="4"/>
+              <w:bottom w:val="single" w:color="BFC7D1" w:sz="4"/>
+              <w:right w:val="single" w:color="BFC7D1" w:sz="4"/>
+            </w:tcBorders>
+            <w:tcMar>
+              <w:top w:type="dxa" w:w="60"/>
+              <w:left w:type="dxa" w:w="100"/>
+              <w:bottom w:type="dxa" w:w="60"/>
+              <w:right w:type="dxa" w:w="100"/>
+            </w:tcMar>
+          </w:tcPr>
+          <w:p>
+            <w:pPr>
+              <w:spacing w:after="0" w:line="252"/>
+            </w:pPr>
+            <w:r>
+              <w:rPr>
+                <w:sz w:val="19"/>
+                <w:szCs w:val="19"/>
+              </w:rPr>
+              <w:t xml:space="preserve">D4 dışındaki bütün senaryo klasörlerinde bulunan son saat. D4 klasöründe bu saatin dosyası yok, o yüzden grafikte D4 yok.</w:t>
+            </w:r>
+          </w:p>
+        </w:tc>
+      </w:tr>
+    </w:tbl>
+    <w:p>
+      <w:pPr>
+        <w:spacing w:after="120"/>
+      </w:pPr>
     </w:p>
     <w:sectPr>
       <w:footerReference w:type="default" r:id="rId6"/>

</xml_diff>